<commit_message>
Corregir redacción de las pruebas en T5, T7 y T10
</commit_message>
<xml_diff>
--- a/Documentos PDC/T5_PDC_1288703.docx
+++ b/Documentos PDC/T5_PDC_1288703.docx
@@ -296,16 +296,8 @@
         <w:rPr>
           <w:lang w:val="es-MX"/>
         </w:rPr>
-        <w:t xml:space="preserve">La prueba ya recorre el camino que pide el taller: una lectura física sale del ESP32, llega al </w:t>
+        <w:t>La prueba ya recorre el camino que pide el taller: una lectura física sale del ESP32, llega al backend</w:t>
       </w:r>
-      <w:proofErr w:type="spellStart"/>
-      <w:r>
-        <w:rPr>
-          <w:lang w:val="es-MX"/>
-        </w:rPr>
-        <w:t>backend</w:t>
-      </w:r>
-      <w:proofErr w:type="spellEnd"/>
       <w:r>
         <w:rPr>
           <w:lang w:val="es-MX"/>
@@ -507,42 +499,12 @@
             <w:pPr>
               <w:spacing w:before="40" w:after="60" w:line="252" w:lineRule="auto"/>
             </w:pPr>
-            <w:proofErr w:type="spellStart"/>
-            <w:r>
-              <w:rPr>
-                <w:sz w:val="18"/>
-              </w:rPr>
-              <w:t>Recorrido</w:t>
-            </w:r>
-            <w:proofErr w:type="spellEnd"/>
-            <w:r>
-              <w:rPr>
-                <w:sz w:val="18"/>
-              </w:rPr>
-              <w:t xml:space="preserve"> </w:t>
-            </w:r>
-            <w:proofErr w:type="spellStart"/>
-            <w:r>
-              <w:rPr>
-                <w:sz w:val="18"/>
-              </w:rPr>
-              <w:t>físico</w:t>
-            </w:r>
-            <w:proofErr w:type="spellEnd"/>
-            <w:r>
-              <w:rPr>
-                <w:sz w:val="18"/>
-              </w:rPr>
-              <w:t xml:space="preserve"> </w:t>
-            </w:r>
-            <w:proofErr w:type="spellStart"/>
-            <w:r>
-              <w:rPr>
-                <w:sz w:val="18"/>
-              </w:rPr>
-              <w:t>público</w:t>
-            </w:r>
-            <w:proofErr w:type="spellEnd"/>
+            <w:r>
+              <w:rPr>
+                <w:sz w:val="18"/>
+              </w:rPr>
+              <w:t>Recorrido físico público</w:t>
+            </w:r>
           </w:p>
         </w:tc>
         <w:tc>
@@ -593,28 +555,12 @@
             <w:pPr>
               <w:spacing w:before="40" w:after="60" w:line="252" w:lineRule="auto"/>
             </w:pPr>
-            <w:proofErr w:type="spellStart"/>
-            <w:r>
-              <w:rPr>
-                <w:sz w:val="18"/>
-              </w:rPr>
-              <w:t>Lecturas</w:t>
-            </w:r>
-            <w:proofErr w:type="spellEnd"/>
-            <w:r>
-              <w:rPr>
-                <w:sz w:val="18"/>
-              </w:rPr>
-              <w:t xml:space="preserve"> </w:t>
-            </w:r>
-            <w:proofErr w:type="spellStart"/>
-            <w:r>
-              <w:rPr>
-                <w:sz w:val="18"/>
-              </w:rPr>
-              <w:t>actuales</w:t>
-            </w:r>
-            <w:proofErr w:type="spellEnd"/>
+            <w:r>
+              <w:rPr>
+                <w:sz w:val="18"/>
+              </w:rPr>
+              <w:t>Lecturas actuales</w:t>
+            </w:r>
           </w:p>
         </w:tc>
         <w:tc>
@@ -665,14 +611,12 @@
             <w:pPr>
               <w:spacing w:before="40" w:after="60" w:line="252" w:lineRule="auto"/>
             </w:pPr>
-            <w:proofErr w:type="spellStart"/>
             <w:r>
               <w:rPr>
                 <w:sz w:val="18"/>
               </w:rPr>
               <w:t>Planeación</w:t>
             </w:r>
-            <w:proofErr w:type="spellEnd"/>
           </w:p>
         </w:tc>
         <w:tc>
@@ -727,16 +671,8 @@
               <w:rPr>
                 <w:sz w:val="18"/>
               </w:rPr>
-              <w:t xml:space="preserve">Control de </w:t>
-            </w:r>
-            <w:proofErr w:type="spellStart"/>
-            <w:r>
-              <w:rPr>
-                <w:sz w:val="18"/>
-              </w:rPr>
-              <w:t>actuadores</w:t>
-            </w:r>
-            <w:proofErr w:type="spellEnd"/>
+              <w:t>Control de actuadores</w:t>
+            </w:r>
           </w:p>
         </w:tc>
         <w:tc>
@@ -762,7 +698,7 @@
                 <w:sz w:val="18"/>
                 <w:lang w:val="es-MX"/>
               </w:rPr>
-              <w:t>Aplazamiento hasta alfa, autorizado según confirmación del responsable.</w:t>
+              <w:t>Aplazamiento hasta alfa, con autorización docente.</w:t>
             </w:r>
           </w:p>
         </w:tc>
@@ -1040,23 +976,7 @@
                 <w:sz w:val="18"/>
                 <w:lang w:val="es-MX"/>
               </w:rPr>
-              <w:t xml:space="preserve">GPIO 4; </w:t>
-            </w:r>
-            <w:proofErr w:type="spellStart"/>
-            <w:r>
-              <w:rPr>
-                <w:sz w:val="18"/>
-                <w:lang w:val="es-MX"/>
-              </w:rPr>
-              <w:t>pull</w:t>
-            </w:r>
-            <w:proofErr w:type="spellEnd"/>
-            <w:r>
-              <w:rPr>
-                <w:sz w:val="18"/>
-                <w:lang w:val="es-MX"/>
-              </w:rPr>
-              <w:t>-up de 4.7 k</w:t>
+              <w:t>GPIO 4; pull-up de 4.7 k</w:t>
             </w:r>
             <w:r>
               <w:rPr>
@@ -1088,33 +1008,11 @@
             <w:pPr>
               <w:spacing w:before="40" w:after="60" w:line="252" w:lineRule="auto"/>
             </w:pPr>
-            <w:proofErr w:type="spellStart"/>
-            <w:r>
-              <w:rPr>
-                <w:sz w:val="18"/>
-              </w:rPr>
-              <w:t>Temperatura</w:t>
-            </w:r>
-            <w:proofErr w:type="spellEnd"/>
-            <w:r>
-              <w:rPr>
-                <w:sz w:val="18"/>
-              </w:rPr>
-              <w:t xml:space="preserve"> </w:t>
-            </w:r>
-            <w:proofErr w:type="spellStart"/>
-            <w:r>
-              <w:rPr>
-                <w:sz w:val="18"/>
-              </w:rPr>
-              <w:t>en</w:t>
-            </w:r>
-            <w:proofErr w:type="spellEnd"/>
-            <w:r>
-              <w:rPr>
-                <w:sz w:val="18"/>
-              </w:rPr>
-              <w:t xml:space="preserve"> °C</w:t>
+            <w:r>
+              <w:rPr>
+                <w:sz w:val="18"/>
+              </w:rPr>
+              <w:t>Temperatura en °C</w:t>
             </w:r>
           </w:p>
         </w:tc>
@@ -1347,16 +1245,8 @@
               <w:rPr>
                 <w:sz w:val="18"/>
               </w:rPr>
-              <w:t xml:space="preserve">pH sin </w:t>
-            </w:r>
-            <w:proofErr w:type="spellStart"/>
-            <w:r>
-              <w:rPr>
-                <w:sz w:val="18"/>
-              </w:rPr>
-              <w:t>unidad</w:t>
-            </w:r>
-            <w:proofErr w:type="spellEnd"/>
+              <w:t>pH sin unidad</w:t>
+            </w:r>
           </w:p>
         </w:tc>
       </w:tr>
@@ -1434,21 +1324,7 @@
               <w:rPr>
                 <w:sz w:val="18"/>
               </w:rPr>
-              <w:t xml:space="preserve">TDS </w:t>
-            </w:r>
-            <w:proofErr w:type="spellStart"/>
-            <w:r>
-              <w:rPr>
-                <w:sz w:val="18"/>
-              </w:rPr>
-              <w:t>en</w:t>
-            </w:r>
-            <w:proofErr w:type="spellEnd"/>
-            <w:r>
-              <w:rPr>
-                <w:sz w:val="18"/>
-              </w:rPr>
-              <w:t xml:space="preserve"> ppm</w:t>
+              <w:t>TDS en ppm</w:t>
             </w:r>
           </w:p>
         </w:tc>
@@ -1566,21 +1442,7 @@
         <w:rPr>
           <w:lang w:val="es-MX"/>
         </w:rPr>
-        <w:t xml:space="preserve">Las figuras 5 y 6 muestran las sondas en agua y el armado real en </w:t>
-      </w:r>
-      <w:proofErr w:type="spellStart"/>
-      <w:r>
-        <w:rPr>
-          <w:lang w:val="es-MX"/>
-        </w:rPr>
-        <w:t>protoboard</w:t>
-      </w:r>
-      <w:proofErr w:type="spellEnd"/>
-      <w:r>
-        <w:rPr>
-          <w:lang w:val="es-MX"/>
-        </w:rPr>
-        <w:t>. Complementan este diagrama de señales con fotografías del banco utilizado.</w:t>
+        <w:t>Las figuras 5 y 6 muestran las sondas en agua y el armado real en protoboard. Complementan este diagrama de señales con fotografías del banco utilizado.</w:t>
       </w:r>
     </w:p>
     <w:p>
@@ -1596,97 +1458,15 @@
           <w:sz w:val="17"/>
           <w:lang w:val="es-MX"/>
         </w:rPr>
-        <w:t xml:space="preserve">Código relacionado: </w:t>
+        <w:t xml:space="preserve">Código relacionado: embedded/HydroMateTelemetry/HydroMateTelemetry.ino, sensor_config.h y </w:t>
       </w:r>
-      <w:proofErr w:type="spellStart"/>
       <w:r>
         <w:rPr>
           <w:i/>
           <w:sz w:val="17"/>
           <w:lang w:val="es-MX"/>
         </w:rPr>
-        <w:t>embedded</w:t>
-      </w:r>
-      <w:proofErr w:type="spellEnd"/>
-      <w:r>
-        <w:rPr>
-          <w:i/>
-          <w:sz w:val="17"/>
-          <w:lang w:val="es-MX"/>
-        </w:rPr>
-        <w:t>/</w:t>
-      </w:r>
-      <w:proofErr w:type="spellStart"/>
-      <w:r>
-        <w:rPr>
-          <w:i/>
-          <w:sz w:val="17"/>
-          <w:lang w:val="es-MX"/>
-        </w:rPr>
-        <w:t>HydroMateTelemetry</w:t>
-      </w:r>
-      <w:proofErr w:type="spellEnd"/>
-      <w:r>
-        <w:rPr>
-          <w:i/>
-          <w:sz w:val="17"/>
-          <w:lang w:val="es-MX"/>
-        </w:rPr>
-        <w:t>/</w:t>
-      </w:r>
-      <w:proofErr w:type="spellStart"/>
-      <w:r>
-        <w:rPr>
-          <w:i/>
-          <w:sz w:val="17"/>
-          <w:lang w:val="es-MX"/>
-        </w:rPr>
-        <w:t>HydroMateTelemetry.ino</w:t>
-      </w:r>
-      <w:proofErr w:type="spellEnd"/>
-      <w:r>
-        <w:rPr>
-          <w:i/>
-          <w:sz w:val="17"/>
-          <w:lang w:val="es-MX"/>
-        </w:rPr>
-        <w:t xml:space="preserve">, </w:t>
-      </w:r>
-      <w:proofErr w:type="spellStart"/>
-      <w:r>
-        <w:rPr>
-          <w:i/>
-          <w:sz w:val="17"/>
-          <w:lang w:val="es-MX"/>
-        </w:rPr>
-        <w:t>sensor_config.h</w:t>
-      </w:r>
-      <w:proofErr w:type="spellEnd"/>
-      <w:r>
-        <w:rPr>
-          <w:i/>
-          <w:sz w:val="17"/>
-          <w:lang w:val="es-MX"/>
-        </w:rPr>
-        <w:t xml:space="preserve"> y </w:t>
-      </w:r>
-      <w:proofErr w:type="spellStart"/>
-      <w:r>
-        <w:rPr>
-          <w:i/>
-          <w:sz w:val="17"/>
-          <w:lang w:val="es-MX"/>
-        </w:rPr>
-        <w:t>telemetry_sensors.h</w:t>
-      </w:r>
-      <w:proofErr w:type="spellEnd"/>
-      <w:r>
-        <w:rPr>
-          <w:i/>
-          <w:sz w:val="17"/>
-          <w:lang w:val="es-MX"/>
-        </w:rPr>
-        <w:t>.</w:t>
+        <w:t>telemetry_sensors.h.</w:t>
       </w:r>
     </w:p>
     <w:p>
@@ -1716,7 +1496,6 @@
           <w:sz w:val="29"/>
           <w:lang w:val="es-MX"/>
         </w:rPr>
-        <w:lastRenderedPageBreak/>
         <w:t>3. Cómo lee y transmite el ESP32</w:t>
       </w:r>
     </w:p>
@@ -1745,16 +1524,8 @@
         <w:rPr>
           <w:lang w:val="es-MX"/>
         </w:rPr>
-        <w:t xml:space="preserve">TDS se compensa con la temperatura medida por DS18B20. Cuando un sensor es inválido, su campo queda en </w:t>
+        <w:t>TDS se compensa con la temperatura medida por DS18B20. Cuando un sensor es inválido, su campo queda en null</w:t>
       </w:r>
-      <w:proofErr w:type="spellStart"/>
-      <w:r>
-        <w:rPr>
-          <w:lang w:val="es-MX"/>
-        </w:rPr>
-        <w:t>null</w:t>
-      </w:r>
-      <w:proofErr w:type="spellEnd"/>
       <w:r>
         <w:rPr>
           <w:lang w:val="es-MX"/>
@@ -1805,31 +1576,13 @@
               <w:keepNext/>
               <w:spacing w:before="40" w:after="60" w:line="252" w:lineRule="auto"/>
             </w:pPr>
-            <w:proofErr w:type="spellStart"/>
             <w:r>
               <w:rPr>
                 <w:b/>
                 <w:sz w:val="18"/>
               </w:rPr>
-              <w:t>Función</w:t>
-            </w:r>
-            <w:proofErr w:type="spellEnd"/>
-            <w:r>
-              <w:rPr>
-                <w:b/>
-                <w:sz w:val="18"/>
-              </w:rPr>
-              <w:t xml:space="preserve"> </w:t>
-            </w:r>
-            <w:proofErr w:type="spellStart"/>
-            <w:r>
-              <w:rPr>
-                <w:b/>
-                <w:sz w:val="18"/>
-              </w:rPr>
-              <w:t>mínima</w:t>
-            </w:r>
-            <w:proofErr w:type="spellEnd"/>
+              <w:t>Función mínima</w:t>
+            </w:r>
           </w:p>
         </w:tc>
         <w:tc>
@@ -1935,28 +1688,12 @@
             <w:pPr>
               <w:spacing w:before="40" w:after="60" w:line="252" w:lineRule="auto"/>
             </w:pPr>
-            <w:proofErr w:type="spellStart"/>
-            <w:r>
-              <w:rPr>
-                <w:sz w:val="18"/>
-              </w:rPr>
-              <w:t>Procesamiento</w:t>
-            </w:r>
-            <w:proofErr w:type="spellEnd"/>
-            <w:r>
-              <w:rPr>
-                <w:sz w:val="18"/>
-              </w:rPr>
-              <w:t xml:space="preserve"> </w:t>
-            </w:r>
-            <w:proofErr w:type="spellStart"/>
-            <w:r>
-              <w:rPr>
-                <w:sz w:val="18"/>
-              </w:rPr>
-              <w:t>básico</w:t>
-            </w:r>
-            <w:proofErr w:type="spellEnd"/>
+            <w:r>
+              <w:rPr>
+                <w:sz w:val="18"/>
+              </w:rPr>
+              <w:t>Procesamiento básico</w:t>
+            </w:r>
           </w:p>
         </w:tc>
         <w:tc>
@@ -2007,33 +1744,11 @@
             <w:pPr>
               <w:spacing w:before="40" w:after="60" w:line="252" w:lineRule="auto"/>
             </w:pPr>
-            <w:proofErr w:type="spellStart"/>
-            <w:r>
-              <w:rPr>
-                <w:sz w:val="18"/>
-              </w:rPr>
-              <w:t>Conexión</w:t>
-            </w:r>
-            <w:proofErr w:type="spellEnd"/>
-            <w:r>
-              <w:rPr>
-                <w:sz w:val="18"/>
-              </w:rPr>
-              <w:t xml:space="preserve"> </w:t>
-            </w:r>
-            <w:proofErr w:type="gramStart"/>
-            <w:r>
-              <w:rPr>
-                <w:sz w:val="18"/>
-              </w:rPr>
-              <w:t>a</w:t>
-            </w:r>
-            <w:proofErr w:type="gramEnd"/>
-            <w:r>
-              <w:rPr>
-                <w:sz w:val="18"/>
-              </w:rPr>
-              <w:t xml:space="preserve"> Internet</w:t>
+            <w:r>
+              <w:rPr>
+                <w:sz w:val="18"/>
+              </w:rPr>
+              <w:t>Conexión a Internet</w:t>
             </w:r>
           </w:p>
         </w:tc>
@@ -2055,21 +1770,12 @@
                 <w:lang w:val="es-MX"/>
               </w:rPr>
             </w:pPr>
-            <w:proofErr w:type="spellStart"/>
-            <w:r>
-              <w:rPr>
-                <w:sz w:val="18"/>
-                <w:lang w:val="es-MX"/>
-              </w:rPr>
-              <w:t>Wi</w:t>
-            </w:r>
-            <w:proofErr w:type="spellEnd"/>
-            <w:r>
-              <w:rPr>
-                <w:sz w:val="18"/>
-                <w:lang w:val="es-MX"/>
-              </w:rPr>
-              <w:t>-Fi de 2.4 GHz y sincronización de reloj para TLS.</w:t>
+            <w:r>
+              <w:rPr>
+                <w:sz w:val="18"/>
+                <w:lang w:val="es-MX"/>
+              </w:rPr>
+              <w:t>Wi-Fi de 2.4 GHz y sincronización de reloj para TLS.</w:t>
             </w:r>
           </w:p>
         </w:tc>
@@ -2094,19 +1800,11 @@
             <w:pPr>
               <w:spacing w:before="40" w:after="60" w:line="252" w:lineRule="auto"/>
             </w:pPr>
-            <w:proofErr w:type="spellStart"/>
-            <w:r>
-              <w:rPr>
-                <w:sz w:val="18"/>
-              </w:rPr>
-              <w:t>Envío</w:t>
-            </w:r>
-            <w:proofErr w:type="spellEnd"/>
-            <w:r>
-              <w:rPr>
-                <w:sz w:val="18"/>
-              </w:rPr>
-              <w:t xml:space="preserve"> al backend</w:t>
+            <w:r>
+              <w:rPr>
+                <w:sz w:val="18"/>
+              </w:rPr>
+              <w:t>Envío al backend</w:t>
             </w:r>
           </w:p>
         </w:tc>
@@ -2203,35 +1901,7 @@
         <w:rPr>
           <w:lang w:val="es-MX"/>
         </w:rPr>
-        <w:t xml:space="preserve">Además del respaldo de 30 segundos, se envía una muestra cuando cambia claramente una variable. El flotador tiene </w:t>
-      </w:r>
-      <w:proofErr w:type="spellStart"/>
-      <w:r>
-        <w:rPr>
-          <w:lang w:val="es-MX"/>
-        </w:rPr>
-        <w:t>antirrebote</w:t>
-      </w:r>
-      <w:proofErr w:type="spellEnd"/>
-      <w:r>
-        <w:rPr>
-          <w:lang w:val="es-MX"/>
-        </w:rPr>
-        <w:t xml:space="preserve"> de 150 ms. Los umbrales están concentrados en </w:t>
-      </w:r>
-      <w:proofErr w:type="spellStart"/>
-      <w:r>
-        <w:rPr>
-          <w:lang w:val="es-MX"/>
-        </w:rPr>
-        <w:t>sensor_config.h</w:t>
-      </w:r>
-      <w:proofErr w:type="spellEnd"/>
-      <w:r>
-        <w:rPr>
-          <w:lang w:val="es-MX"/>
-        </w:rPr>
-        <w:t>; por ejemplo, luz cambia por 50 lux o 30 %, y temperatura por 1 °C.</w:t>
+        <w:t>Además del respaldo de 30 segundos, se envía una muestra cuando cambia claramente una variable. El flotador tiene antirrebote de 150 ms. Los umbrales están concentrados en sensor_config.h; por ejemplo, luz cambia por 50 lux o 30 %, y temperatura por 1 °C.</w:t>
       </w:r>
     </w:p>
     <w:p>
@@ -2245,16 +1915,8 @@
         <w:rPr>
           <w:lang w:val="es-MX"/>
         </w:rPr>
-        <w:t xml:space="preserve">Cada muestra pendiente se guarda en NVS, una memoria que conserva </w:t>
+        <w:t>Cada muestra pendiente se guarda en NVS, una memoria que conserva información</w:t>
       </w:r>
-      <w:proofErr w:type="gramStart"/>
-      <w:r>
-        <w:rPr>
-          <w:lang w:val="es-MX"/>
-        </w:rPr>
-        <w:t>información</w:t>
-      </w:r>
-      <w:proofErr w:type="gramEnd"/>
       <w:r>
         <w:rPr>
           <w:lang w:val="es-MX"/>
@@ -2269,51 +1931,13 @@
           <w:lang w:val="es-MX"/>
         </w:rPr>
       </w:pPr>
-      <w:proofErr w:type="spellStart"/>
       <w:r>
         <w:rPr>
           <w:rFonts w:ascii="Consolas" w:hAnsi="Consolas"/>
           <w:sz w:val="18"/>
           <w:lang w:val="es-MX"/>
         </w:rPr>
-        <w:t>hydromate</w:t>
-      </w:r>
-      <w:proofErr w:type="spellEnd"/>
-      <w:r>
-        <w:rPr>
-          <w:rFonts w:ascii="Consolas" w:hAnsi="Consolas"/>
-          <w:sz w:val="18"/>
-          <w:lang w:val="es-MX"/>
-        </w:rPr>
-        <w:t>/hydromate-01/</w:t>
-      </w:r>
-      <w:proofErr w:type="spellStart"/>
-      <w:proofErr w:type="gramStart"/>
-      <w:r>
-        <w:rPr>
-          <w:rFonts w:ascii="Consolas" w:hAnsi="Consolas"/>
-          <w:sz w:val="18"/>
-          <w:lang w:val="es-MX"/>
-        </w:rPr>
-        <w:t>telemetry</w:t>
-      </w:r>
-      <w:proofErr w:type="spellEnd"/>
-      <w:r>
-        <w:rPr>
-          <w:rFonts w:ascii="Consolas" w:hAnsi="Consolas"/>
-          <w:sz w:val="18"/>
-          <w:lang w:val="es-MX"/>
-        </w:rPr>
-        <w:t xml:space="preserve">  →</w:t>
-      </w:r>
-      <w:proofErr w:type="gramEnd"/>
-      <w:r>
-        <w:rPr>
-          <w:rFonts w:ascii="Consolas" w:hAnsi="Consolas"/>
-          <w:sz w:val="18"/>
-          <w:lang w:val="es-MX"/>
-        </w:rPr>
-        <w:t xml:space="preserve">  lectura JSON</w:t>
+        <w:t>hydromate/hydromate-01/telemetry  →  lectura JSON</w:t>
       </w:r>
       <w:r>
         <w:rPr>
@@ -2322,71 +1946,8 @@
           <w:lang w:val="es-MX"/>
         </w:rPr>
         <w:br/>
+        <w:t>hydromate/hydromate-01/ack        ←  confirmación stored</w:t>
       </w:r>
-      <w:proofErr w:type="spellStart"/>
-      <w:r>
-        <w:rPr>
-          <w:rFonts w:ascii="Consolas" w:hAnsi="Consolas"/>
-          <w:sz w:val="18"/>
-          <w:lang w:val="es-MX"/>
-        </w:rPr>
-        <w:t>hydromate</w:t>
-      </w:r>
-      <w:proofErr w:type="spellEnd"/>
-      <w:r>
-        <w:rPr>
-          <w:rFonts w:ascii="Consolas" w:hAnsi="Consolas"/>
-          <w:sz w:val="18"/>
-          <w:lang w:val="es-MX"/>
-        </w:rPr>
-        <w:t>/hydromate-01/</w:t>
-      </w:r>
-      <w:proofErr w:type="spellStart"/>
-      <w:r>
-        <w:rPr>
-          <w:rFonts w:ascii="Consolas" w:hAnsi="Consolas"/>
-          <w:sz w:val="18"/>
-          <w:lang w:val="es-MX"/>
-        </w:rPr>
-        <w:t>ack</w:t>
-      </w:r>
-      <w:proofErr w:type="spellEnd"/>
-      <w:r>
-        <w:rPr>
-          <w:rFonts w:ascii="Consolas" w:hAnsi="Consolas"/>
-          <w:sz w:val="18"/>
-          <w:lang w:val="es-MX"/>
-        </w:rPr>
-        <w:t xml:space="preserve">        </w:t>
-      </w:r>
-      <w:proofErr w:type="gramStart"/>
-      <w:r>
-        <w:rPr>
-          <w:rFonts w:ascii="Consolas" w:hAnsi="Consolas"/>
-          <w:sz w:val="18"/>
-          <w:lang w:val="es-MX"/>
-        </w:rPr>
-        <w:t>←  confirmación</w:t>
-      </w:r>
-      <w:proofErr w:type="gramEnd"/>
-      <w:r>
-        <w:rPr>
-          <w:rFonts w:ascii="Consolas" w:hAnsi="Consolas"/>
-          <w:sz w:val="18"/>
-          <w:lang w:val="es-MX"/>
-        </w:rPr>
-        <w:t xml:space="preserve"> </w:t>
-      </w:r>
-      <w:proofErr w:type="spellStart"/>
-      <w:r>
-        <w:rPr>
-          <w:rFonts w:ascii="Consolas" w:hAnsi="Consolas"/>
-          <w:sz w:val="18"/>
-          <w:lang w:val="es-MX"/>
-        </w:rPr>
-        <w:t>stored</w:t>
-      </w:r>
-      <w:proofErr w:type="spellEnd"/>
     </w:p>
     <w:p>
       <w:pPr>
@@ -2395,61 +1956,11 @@
           <w:lang w:val="es-MX"/>
         </w:rPr>
       </w:pPr>
-      <w:proofErr w:type="spellStart"/>
       <w:r>
         <w:rPr>
           <w:lang w:val="es-MX"/>
         </w:rPr>
-        <w:t>Wi</w:t>
-      </w:r>
-      <w:proofErr w:type="spellEnd"/>
-      <w:r>
-        <w:rPr>
-          <w:lang w:val="es-MX"/>
-        </w:rPr>
-        <w:t xml:space="preserve">-Fi, usuario MQTT, contraseña y CA se configuran en </w:t>
-      </w:r>
-      <w:proofErr w:type="spellStart"/>
-      <w:r>
-        <w:rPr>
-          <w:lang w:val="es-MX"/>
-        </w:rPr>
-        <w:t>secrets.h</w:t>
-      </w:r>
-      <w:proofErr w:type="spellEnd"/>
-      <w:r>
-        <w:rPr>
-          <w:lang w:val="es-MX"/>
-        </w:rPr>
-        <w:t xml:space="preserve"> privado, excluido de Git. Producción valida el certificado y el </w:t>
-      </w:r>
-      <w:proofErr w:type="spellStart"/>
-      <w:r>
-        <w:rPr>
-          <w:lang w:val="es-MX"/>
-        </w:rPr>
-        <w:t>hostname</w:t>
-      </w:r>
-      <w:proofErr w:type="spellEnd"/>
-      <w:r>
-        <w:rPr>
-          <w:lang w:val="es-MX"/>
-        </w:rPr>
-        <w:t xml:space="preserve">; no utiliza </w:t>
-      </w:r>
-      <w:proofErr w:type="spellStart"/>
-      <w:r>
-        <w:rPr>
-          <w:lang w:val="es-MX"/>
-        </w:rPr>
-        <w:t>setInsecure</w:t>
-      </w:r>
-      <w:proofErr w:type="spellEnd"/>
-      <w:r>
-        <w:rPr>
-          <w:lang w:val="es-MX"/>
-        </w:rPr>
-        <w:t>.</w:t>
+        <w:t>Wi-Fi, usuario MQTT, contraseña y CA se configuran en secrets.h privado, excluido de Git. Producción valida el certificado y el hostname; no utiliza setInsecure.</w:t>
       </w:r>
     </w:p>
     <w:p>
@@ -2479,19 +1990,8 @@
           <w:sz w:val="29"/>
           <w:lang w:val="es-MX"/>
         </w:rPr>
-        <w:lastRenderedPageBreak/>
-        <w:t xml:space="preserve">4. </w:t>
+        <w:t>4. Backend</w:t>
       </w:r>
-      <w:proofErr w:type="spellStart"/>
-      <w:r>
-        <w:rPr>
-          <w:b/>
-          <w:sz w:val="29"/>
-          <w:lang w:val="es-MX"/>
-        </w:rPr>
-        <w:t>Backend</w:t>
-      </w:r>
-      <w:proofErr w:type="spellEnd"/>
       <w:r>
         <w:rPr>
           <w:b/>
@@ -2512,49 +2012,7 @@
         <w:rPr>
           <w:lang w:val="es-MX"/>
         </w:rPr>
-        <w:t xml:space="preserve">El </w:t>
-      </w:r>
-      <w:proofErr w:type="spellStart"/>
-      <w:r>
-        <w:rPr>
-          <w:lang w:val="es-MX"/>
-        </w:rPr>
-        <w:t>backend</w:t>
-      </w:r>
-      <w:proofErr w:type="spellEnd"/>
-      <w:r>
-        <w:rPr>
-          <w:lang w:val="es-MX"/>
-        </w:rPr>
-        <w:t xml:space="preserve"> es una API Laravel desplegada en una VPS Ubuntu de </w:t>
-      </w:r>
-      <w:proofErr w:type="spellStart"/>
-      <w:r>
-        <w:rPr>
-          <w:lang w:val="es-MX"/>
-        </w:rPr>
-        <w:t>OVHcloud</w:t>
-      </w:r>
-      <w:proofErr w:type="spellEnd"/>
-      <w:r>
-        <w:rPr>
-          <w:lang w:val="es-MX"/>
-        </w:rPr>
-        <w:t xml:space="preserve">. </w:t>
-      </w:r>
-      <w:proofErr w:type="spellStart"/>
-      <w:r>
-        <w:rPr>
-          <w:lang w:val="es-MX"/>
-        </w:rPr>
-        <w:t>Mosquitto</w:t>
-      </w:r>
-      <w:proofErr w:type="spellEnd"/>
-      <w:r>
-        <w:rPr>
-          <w:lang w:val="es-MX"/>
-        </w:rPr>
-        <w:t xml:space="preserve"> recibe la telemetría y el bridge Python la convierte en una petición HTTP interna. Laravel valida el contenido y lo guarda en PostgreSQL.</w:t>
+        <w:t>El backend es una API Laravel desplegada en una VPS Ubuntu de OVHcloud. Mosquitto recibe la telemetría y el bridge Python la convierte en una petición HTTP interna. Laravel valida el contenido y lo guarda en PostgreSQL.</w:t>
       </w:r>
     </w:p>
     <w:p>
@@ -2568,21 +2026,7 @@
         <w:rPr>
           <w:lang w:val="es-MX"/>
         </w:rPr>
-        <w:t xml:space="preserve">La API se consulta públicamente en https://hydromate-kevin.duckdns.org:9443. En la revisión del 21 de octubre, /up, el historial y el estado de hydromate-01 respondieron HTTP 200. Se recuperaron 20 registros con origen real y el estado de telemetría fue </w:t>
-      </w:r>
-      <w:proofErr w:type="spellStart"/>
-      <w:r>
-        <w:rPr>
-          <w:lang w:val="es-MX"/>
-        </w:rPr>
-        <w:t>recent</w:t>
-      </w:r>
-      <w:proofErr w:type="spellEnd"/>
-      <w:r>
-        <w:rPr>
-          <w:lang w:val="es-MX"/>
-        </w:rPr>
-        <w:t>.</w:t>
+        <w:t>La API se consulta públicamente en https://hydromate-kevin.duckdns.org:9443. En la revisión del 21 de octubre, /up, el historial y el estado de hydromate-01 respondieron HTTP 200. Se recuperaron 20 registros con origen real y el estado de telemetría fue recent.</w:t>
       </w:r>
     </w:p>
     <w:tbl>
@@ -2628,7 +2072,6 @@
               <w:keepNext/>
               <w:spacing w:before="40" w:after="60" w:line="252" w:lineRule="auto"/>
             </w:pPr>
-            <w:proofErr w:type="spellStart"/>
             <w:r>
               <w:rPr>
                 <w:b/>
@@ -2636,7 +2079,6 @@
               </w:rPr>
               <w:t>Operación</w:t>
             </w:r>
-            <w:proofErr w:type="spellEnd"/>
           </w:p>
         </w:tc>
         <w:tc>
@@ -2746,21 +2188,7 @@
               <w:rPr>
                 <w:sz w:val="18"/>
               </w:rPr>
-              <w:t>GET /</w:t>
-            </w:r>
-            <w:proofErr w:type="spellStart"/>
-            <w:r>
-              <w:rPr>
-                <w:sz w:val="18"/>
-              </w:rPr>
-              <w:t>api</w:t>
-            </w:r>
-            <w:proofErr w:type="spellEnd"/>
-            <w:r>
-              <w:rPr>
-                <w:sz w:val="18"/>
-              </w:rPr>
-              <w:t>/measurements</w:t>
+              <w:t>GET /api/measurements</w:t>
             </w:r>
           </w:p>
         </w:tc>
@@ -2787,55 +2215,7 @@
                 <w:sz w:val="18"/>
                 <w:lang w:val="es-MX"/>
               </w:rPr>
-              <w:t xml:space="preserve">Consulta historial por </w:t>
-            </w:r>
-            <w:proofErr w:type="spellStart"/>
-            <w:r>
-              <w:rPr>
-                <w:sz w:val="18"/>
-                <w:lang w:val="es-MX"/>
-              </w:rPr>
-              <w:t>device_id</w:t>
-            </w:r>
-            <w:proofErr w:type="spellEnd"/>
-            <w:r>
-              <w:rPr>
-                <w:sz w:val="18"/>
-                <w:lang w:val="es-MX"/>
-              </w:rPr>
-              <w:t xml:space="preserve"> y </w:t>
-            </w:r>
-            <w:proofErr w:type="spellStart"/>
-            <w:r>
-              <w:rPr>
-                <w:sz w:val="18"/>
-                <w:lang w:val="es-MX"/>
-              </w:rPr>
-              <w:t>limit</w:t>
-            </w:r>
-            <w:proofErr w:type="spellEnd"/>
-            <w:r>
-              <w:rPr>
-                <w:sz w:val="18"/>
-                <w:lang w:val="es-MX"/>
-              </w:rPr>
-              <w:t xml:space="preserve">; </w:t>
-            </w:r>
-            <w:proofErr w:type="spellStart"/>
-            <w:r>
-              <w:rPr>
-                <w:sz w:val="18"/>
-                <w:lang w:val="es-MX"/>
-              </w:rPr>
-              <w:t>real_only</w:t>
-            </w:r>
-            <w:proofErr w:type="spellEnd"/>
-            <w:r>
-              <w:rPr>
-                <w:sz w:val="18"/>
-                <w:lang w:val="es-MX"/>
-              </w:rPr>
-              <w:t>=1 filtra datos simulados.</w:t>
+              <w:t>Consulta historial por device_id y limit; real_only=1 filtra datos simulados.</w:t>
             </w:r>
           </w:p>
         </w:tc>
@@ -2864,21 +2244,7 @@
               <w:rPr>
                 <w:sz w:val="18"/>
               </w:rPr>
-              <w:t>GET /</w:t>
-            </w:r>
-            <w:proofErr w:type="spellStart"/>
-            <w:r>
-              <w:rPr>
-                <w:sz w:val="18"/>
-              </w:rPr>
-              <w:t>api</w:t>
-            </w:r>
-            <w:proofErr w:type="spellEnd"/>
-            <w:r>
-              <w:rPr>
-                <w:sz w:val="18"/>
-              </w:rPr>
-              <w:t>/measurements/latest</w:t>
+              <w:t>GET /api/measurements/latest</w:t>
             </w:r>
           </w:p>
         </w:tc>
@@ -2934,21 +2300,7 @@
               <w:rPr>
                 <w:sz w:val="18"/>
               </w:rPr>
-              <w:t>GET /</w:t>
-            </w:r>
-            <w:proofErr w:type="spellStart"/>
-            <w:r>
-              <w:rPr>
-                <w:sz w:val="18"/>
-              </w:rPr>
-              <w:t>api</w:t>
-            </w:r>
-            <w:proofErr w:type="spellEnd"/>
-            <w:r>
-              <w:rPr>
-                <w:sz w:val="18"/>
-              </w:rPr>
-              <w:t>/devices/hydromate-01/status</w:t>
+              <w:t>GET /api/devices/hydromate-01/status</w:t>
             </w:r>
           </w:p>
         </w:tc>
@@ -2975,55 +2327,7 @@
                 <w:sz w:val="18"/>
                 <w:lang w:val="es-MX"/>
               </w:rPr>
-              <w:t xml:space="preserve">Informa antigüedad de telemetría: </w:t>
-            </w:r>
-            <w:proofErr w:type="spellStart"/>
-            <w:r>
-              <w:rPr>
-                <w:sz w:val="18"/>
-                <w:lang w:val="es-MX"/>
-              </w:rPr>
-              <w:t>no_data</w:t>
-            </w:r>
-            <w:proofErr w:type="spellEnd"/>
-            <w:r>
-              <w:rPr>
-                <w:sz w:val="18"/>
-                <w:lang w:val="es-MX"/>
-              </w:rPr>
-              <w:t xml:space="preserve">, </w:t>
-            </w:r>
-            <w:proofErr w:type="spellStart"/>
-            <w:r>
-              <w:rPr>
-                <w:sz w:val="18"/>
-                <w:lang w:val="es-MX"/>
-              </w:rPr>
-              <w:t>recent</w:t>
-            </w:r>
-            <w:proofErr w:type="spellEnd"/>
-            <w:r>
-              <w:rPr>
-                <w:sz w:val="18"/>
-                <w:lang w:val="es-MX"/>
-              </w:rPr>
-              <w:t xml:space="preserve"> o </w:t>
-            </w:r>
-            <w:proofErr w:type="spellStart"/>
-            <w:r>
-              <w:rPr>
-                <w:sz w:val="18"/>
-                <w:lang w:val="es-MX"/>
-              </w:rPr>
-              <w:t>stale</w:t>
-            </w:r>
-            <w:proofErr w:type="spellEnd"/>
-            <w:r>
-              <w:rPr>
-                <w:sz w:val="18"/>
-                <w:lang w:val="es-MX"/>
-              </w:rPr>
-              <w:t>.</w:t>
+              <w:t>Informa antigüedad de telemetría: no_data, recent o stale.</w:t>
             </w:r>
           </w:p>
         </w:tc>
@@ -3104,21 +2408,7 @@
         <w:rPr>
           <w:lang w:val="es-MX"/>
         </w:rPr>
-        <w:t xml:space="preserve">Los campos indispensables incluyen identidad y secuencia, versión, valores y origen de cada sensor. El flotador debe ser un booleano JSON y los números deben estar dentro del rango aceptado. El </w:t>
-      </w:r>
-      <w:proofErr w:type="spellStart"/>
-      <w:r>
-        <w:rPr>
-          <w:lang w:val="es-MX"/>
-        </w:rPr>
-        <w:t>backend</w:t>
-      </w:r>
-      <w:proofErr w:type="spellEnd"/>
-      <w:r>
-        <w:rPr>
-          <w:lang w:val="es-MX"/>
-        </w:rPr>
-        <w:t xml:space="preserve"> conserva el mismo contrato para registrar y consultar.</w:t>
+        <w:t>Los campos indispensables incluyen identidad y secuencia, versión, valores y origen de cada sensor. El flotador debe ser un booleano JSON y los números deben estar dentro del rango aceptado. El backend conserva el mismo contrato para registrar y consultar.</w:t>
       </w:r>
     </w:p>
     <w:p>
@@ -3161,63 +2451,13 @@
         <w:rPr>
           <w:lang w:val="es-MX"/>
         </w:rPr>
-        <w:t xml:space="preserve">Docker </w:t>
+        <w:t>Docker rootless</w:t>
       </w:r>
-      <w:proofErr w:type="spellStart"/>
       <w:r>
         <w:rPr>
           <w:lang w:val="es-MX"/>
         </w:rPr>
-        <w:t>rootless</w:t>
-      </w:r>
-      <w:proofErr w:type="spellEnd"/>
-      <w:r>
-        <w:rPr>
-          <w:lang w:val="es-MX"/>
-        </w:rPr>
-        <w:t xml:space="preserve"> ejecuta únicamente los servicios de </w:t>
-      </w:r>
-      <w:proofErr w:type="spellStart"/>
-      <w:r>
-        <w:rPr>
-          <w:lang w:val="es-MX"/>
-        </w:rPr>
-        <w:t>HydroMate</w:t>
-      </w:r>
-      <w:proofErr w:type="spellEnd"/>
-      <w:r>
-        <w:rPr>
-          <w:lang w:val="es-MX"/>
-        </w:rPr>
-        <w:t xml:space="preserve">. </w:t>
-      </w:r>
-      <w:proofErr w:type="gramStart"/>
-      <w:r>
-        <w:rPr>
-          <w:lang w:val="es-MX"/>
-        </w:rPr>
-        <w:t>API interna</w:t>
-      </w:r>
-      <w:proofErr w:type="gramEnd"/>
-      <w:r>
-        <w:rPr>
-          <w:lang w:val="es-MX"/>
-        </w:rPr>
-        <w:t xml:space="preserve"> en 127.0.0.1:8081; HTTPS público en 9443; MQTT TLS en 8884. PostgreSQL no publica 5432 al host. Los volúmenes, red y secretos pertenecen a </w:t>
-      </w:r>
-      <w:proofErr w:type="spellStart"/>
-      <w:r>
-        <w:rPr>
-          <w:lang w:val="es-MX"/>
-        </w:rPr>
-        <w:t>HydroMate</w:t>
-      </w:r>
-      <w:proofErr w:type="spellEnd"/>
-      <w:r>
-        <w:rPr>
-          <w:lang w:val="es-MX"/>
-        </w:rPr>
-        <w:t>. Android se ejecuta en el teléfono.</w:t>
+        <w:t xml:space="preserve"> ejecuta únicamente los servicios de HydroMate. API interna en 127.0.0.1:8081; HTTPS público en 9443; MQTT TLS en 8884. PostgreSQL no publica 5432 al host. Los volúmenes, red y secretos pertenecen a HydroMate. Android se ejecuta en el teléfono.</w:t>
       </w:r>
     </w:p>
     <w:p>
@@ -3233,79 +2473,7 @@
           <w:sz w:val="17"/>
           <w:lang w:val="es-MX"/>
         </w:rPr>
-        <w:t>Evidencia: evidencias/api-</w:t>
-      </w:r>
-      <w:proofErr w:type="spellStart"/>
-      <w:r>
-        <w:rPr>
-          <w:i/>
-          <w:sz w:val="17"/>
-          <w:lang w:val="es-MX"/>
-        </w:rPr>
-        <w:t>publica.json</w:t>
-      </w:r>
-      <w:proofErr w:type="spellEnd"/>
-      <w:r>
-        <w:rPr>
-          <w:i/>
-          <w:sz w:val="17"/>
-          <w:lang w:val="es-MX"/>
-        </w:rPr>
-        <w:t xml:space="preserve">; </w:t>
-      </w:r>
-      <w:proofErr w:type="spellStart"/>
-      <w:r>
-        <w:rPr>
-          <w:i/>
-          <w:sz w:val="17"/>
-          <w:lang w:val="es-MX"/>
-        </w:rPr>
-        <w:t>compose.production.yml</w:t>
-      </w:r>
-      <w:proofErr w:type="spellEnd"/>
-      <w:r>
-        <w:rPr>
-          <w:i/>
-          <w:sz w:val="17"/>
-          <w:lang w:val="es-MX"/>
-        </w:rPr>
-        <w:t xml:space="preserve">; </w:t>
-      </w:r>
-      <w:proofErr w:type="spellStart"/>
-      <w:r>
-        <w:rPr>
-          <w:i/>
-          <w:sz w:val="17"/>
-          <w:lang w:val="es-MX"/>
-        </w:rPr>
-        <w:t>deployment</w:t>
-      </w:r>
-      <w:proofErr w:type="spellEnd"/>
-      <w:r>
-        <w:rPr>
-          <w:i/>
-          <w:sz w:val="17"/>
-          <w:lang w:val="es-MX"/>
-        </w:rPr>
-        <w:t xml:space="preserve">/deploy.sh; </w:t>
-      </w:r>
-      <w:proofErr w:type="spellStart"/>
-      <w:r>
-        <w:rPr>
-          <w:i/>
-          <w:sz w:val="17"/>
-          <w:lang w:val="es-MX"/>
-        </w:rPr>
-        <w:t>docs</w:t>
-      </w:r>
-      <w:proofErr w:type="spellEnd"/>
-      <w:r>
-        <w:rPr>
-          <w:i/>
-          <w:sz w:val="17"/>
-          <w:lang w:val="es-MX"/>
-        </w:rPr>
-        <w:t>/PUBLIC_ACCESS.md. La comprobación pública fue de solo lectura y no requirió acceso SSH.</w:t>
+        <w:t>Evidencia: evidencias/api-publica.json; compose.production.yml; deployment/deploy.sh; docs/PUBLIC_ACCESS.md. La comprobación pública fue de solo lectura y no requirió acceso SSH.</w:t>
       </w:r>
     </w:p>
     <w:p>
@@ -3321,133 +2489,15 @@
           <w:sz w:val="17"/>
           <w:lang w:val="es-MX"/>
         </w:rPr>
-        <w:t xml:space="preserve">Código: </w:t>
+        <w:t>Código: hydromate-backend/app/Http/Requests/StoreMeasurementRequest.php</w:t>
       </w:r>
-      <w:proofErr w:type="spellStart"/>
       <w:r>
         <w:rPr>
           <w:i/>
           <w:sz w:val="17"/>
           <w:lang w:val="es-MX"/>
         </w:rPr>
-        <w:t>hydromate-backend</w:t>
-      </w:r>
-      <w:proofErr w:type="spellEnd"/>
-      <w:r>
-        <w:rPr>
-          <w:i/>
-          <w:sz w:val="17"/>
-          <w:lang w:val="es-MX"/>
-        </w:rPr>
-        <w:t>/app/Http/</w:t>
-      </w:r>
-      <w:proofErr w:type="spellStart"/>
-      <w:r>
-        <w:rPr>
-          <w:i/>
-          <w:sz w:val="17"/>
-          <w:lang w:val="es-MX"/>
-        </w:rPr>
-        <w:t>Requests</w:t>
-      </w:r>
-      <w:proofErr w:type="spellEnd"/>
-      <w:r>
-        <w:rPr>
-          <w:i/>
-          <w:sz w:val="17"/>
-          <w:lang w:val="es-MX"/>
-        </w:rPr>
-        <w:t>/</w:t>
-      </w:r>
-      <w:proofErr w:type="spellStart"/>
-      <w:r>
-        <w:rPr>
-          <w:i/>
-          <w:sz w:val="17"/>
-          <w:lang w:val="es-MX"/>
-        </w:rPr>
-        <w:t>StoreMeasurementRequest.php</w:t>
-      </w:r>
-      <w:proofErr w:type="spellEnd"/>
-      <w:r>
-        <w:rPr>
-          <w:i/>
-          <w:sz w:val="17"/>
-          <w:lang w:val="es-MX"/>
-        </w:rPr>
-        <w:t xml:space="preserve"> valida; app/Http/</w:t>
-      </w:r>
-      <w:proofErr w:type="spellStart"/>
-      <w:r>
-        <w:rPr>
-          <w:i/>
-          <w:sz w:val="17"/>
-          <w:lang w:val="es-MX"/>
-        </w:rPr>
-        <w:t>Controllers</w:t>
-      </w:r>
-      <w:proofErr w:type="spellEnd"/>
-      <w:r>
-        <w:rPr>
-          <w:i/>
-          <w:sz w:val="17"/>
-          <w:lang w:val="es-MX"/>
-        </w:rPr>
-        <w:t>/Api/</w:t>
-      </w:r>
-      <w:proofErr w:type="spellStart"/>
-      <w:r>
-        <w:rPr>
-          <w:i/>
-          <w:sz w:val="17"/>
-          <w:lang w:val="es-MX"/>
-        </w:rPr>
-        <w:t>MeasurementController.php</w:t>
-      </w:r>
-      <w:proofErr w:type="spellEnd"/>
-      <w:r>
-        <w:rPr>
-          <w:i/>
-          <w:sz w:val="17"/>
-          <w:lang w:val="es-MX"/>
-        </w:rPr>
-        <w:t xml:space="preserve"> registra y consulta; scripts/mqtt_bridge.py recibe MQTT y entrega a la API. Las rutas </w:t>
-      </w:r>
-      <w:proofErr w:type="gramStart"/>
-      <w:r>
-        <w:rPr>
-          <w:i/>
-          <w:sz w:val="17"/>
-          <w:lang w:val="es-MX"/>
-        </w:rPr>
-        <w:t>app</w:t>
-      </w:r>
-      <w:proofErr w:type="gramEnd"/>
-      <w:r>
-        <w:rPr>
-          <w:i/>
-          <w:sz w:val="17"/>
-          <w:lang w:val="es-MX"/>
-        </w:rPr>
-        <w:t xml:space="preserve">/ parten de </w:t>
-      </w:r>
-      <w:proofErr w:type="spellStart"/>
-      <w:r>
-        <w:rPr>
-          <w:i/>
-          <w:sz w:val="17"/>
-          <w:lang w:val="es-MX"/>
-        </w:rPr>
-        <w:t>hydromate-backend</w:t>
-      </w:r>
-      <w:proofErr w:type="spellEnd"/>
-      <w:r>
-        <w:rPr>
-          <w:i/>
-          <w:sz w:val="17"/>
-          <w:lang w:val="es-MX"/>
-        </w:rPr>
-        <w:t>/.</w:t>
+        <w:t xml:space="preserve"> valida; app/Http/Controllers/Api/MeasurementController.php registra y consulta; scripts/mqtt_bridge.py recibe MQTT y entrega a la API. Las rutas app/ parten de hydromate-backend/.</w:t>
       </w:r>
     </w:p>
     <w:p>
@@ -3477,7 +2527,6 @@
           <w:sz w:val="29"/>
           <w:lang w:val="es-MX"/>
         </w:rPr>
-        <w:lastRenderedPageBreak/>
         <w:t>5. Estructura de la base de datos</w:t>
       </w:r>
     </w:p>
@@ -3492,21 +2541,7 @@
         <w:rPr>
           <w:lang w:val="es-MX"/>
         </w:rPr>
-        <w:t xml:space="preserve">La colección mínima se resuelve con la tabla </w:t>
-      </w:r>
-      <w:proofErr w:type="spellStart"/>
-      <w:r>
-        <w:rPr>
-          <w:lang w:val="es-MX"/>
-        </w:rPr>
-        <w:t>measurements</w:t>
-      </w:r>
-      <w:proofErr w:type="spellEnd"/>
-      <w:r>
-        <w:rPr>
-          <w:lang w:val="es-MX"/>
-        </w:rPr>
-        <w:t>. Cada fila representa una adquisición de una torre y contiene las variables disponibles en ese instante. Las unidades se conservan en el contrato y en los nombres de campo; no hace falta una tabla por sensor.</w:t>
+        <w:t>La colección mínima se resuelve con la tabla measurements. Cada fila representa una adquisición de una torre y contiene las variables disponibles en ese instante. Las unidades se conservan en el contrato y en los nombres de campo; no hace falta una tabla por sensor.</w:t>
       </w:r>
     </w:p>
     <w:tbl>
@@ -3664,19 +2699,11 @@
             <w:pPr>
               <w:spacing w:before="40" w:after="60" w:line="252" w:lineRule="auto"/>
             </w:pPr>
-            <w:proofErr w:type="spellStart"/>
-            <w:r>
-              <w:rPr>
-                <w:sz w:val="18"/>
-              </w:rPr>
-              <w:t>device_id</w:t>
-            </w:r>
-            <w:proofErr w:type="spellEnd"/>
-            <w:r>
-              <w:rPr>
-                <w:sz w:val="18"/>
-              </w:rPr>
-              <w:t xml:space="preserve"> y sequence</w:t>
+            <w:r>
+              <w:rPr>
+                <w:sz w:val="18"/>
+              </w:rPr>
+              <w:t>device_id y sequence</w:t>
             </w:r>
           </w:p>
         </w:tc>
@@ -3728,28 +2755,12 @@
             <w:pPr>
               <w:spacing w:before="40" w:after="60" w:line="252" w:lineRule="auto"/>
             </w:pPr>
-            <w:proofErr w:type="spellStart"/>
-            <w:r>
-              <w:rPr>
-                <w:sz w:val="18"/>
-              </w:rPr>
-              <w:t>temperature_c</w:t>
-            </w:r>
-            <w:proofErr w:type="spellEnd"/>
-            <w:r>
-              <w:rPr>
-                <w:sz w:val="18"/>
-              </w:rPr>
-              <w:t xml:space="preserve"> y </w:t>
-            </w:r>
-            <w:proofErr w:type="spellStart"/>
-            <w:r>
-              <w:rPr>
-                <w:sz w:val="18"/>
-              </w:rPr>
-              <w:t>light_lux</w:t>
-            </w:r>
-            <w:proofErr w:type="spellEnd"/>
+            <w:r>
+              <w:rPr>
+                <w:sz w:val="18"/>
+              </w:rPr>
+              <w:t>temperature_c y light_lux</w:t>
+            </w:r>
           </w:p>
         </w:tc>
         <w:tc>
@@ -3800,14 +2811,12 @@
             <w:pPr>
               <w:spacing w:before="40" w:after="60" w:line="252" w:lineRule="auto"/>
             </w:pPr>
-            <w:proofErr w:type="spellStart"/>
             <w:r>
               <w:rPr>
                 <w:sz w:val="18"/>
               </w:rPr>
               <w:t>water_present</w:t>
             </w:r>
-            <w:proofErr w:type="spellEnd"/>
           </w:p>
         </w:tc>
         <w:tc>
@@ -3858,28 +2867,12 @@
             <w:pPr>
               <w:spacing w:before="40" w:after="60" w:line="252" w:lineRule="auto"/>
             </w:pPr>
-            <w:proofErr w:type="spellStart"/>
-            <w:r>
-              <w:rPr>
-                <w:sz w:val="18"/>
-              </w:rPr>
-              <w:t>ph</w:t>
-            </w:r>
-            <w:proofErr w:type="spellEnd"/>
-            <w:r>
-              <w:rPr>
-                <w:sz w:val="18"/>
-              </w:rPr>
-              <w:t xml:space="preserve"> y </w:t>
-            </w:r>
-            <w:proofErr w:type="spellStart"/>
-            <w:r>
-              <w:rPr>
-                <w:sz w:val="18"/>
-              </w:rPr>
-              <w:t>tds_ppm</w:t>
-            </w:r>
-            <w:proofErr w:type="spellEnd"/>
+            <w:r>
+              <w:rPr>
+                <w:sz w:val="18"/>
+              </w:rPr>
+              <w:t>ph y tds_ppm</w:t>
+            </w:r>
           </w:p>
         </w:tc>
         <w:tc>
@@ -3930,14 +2923,12 @@
             <w:pPr>
               <w:spacing w:before="40" w:after="60" w:line="252" w:lineRule="auto"/>
             </w:pPr>
-            <w:proofErr w:type="spellStart"/>
             <w:r>
               <w:rPr>
                 <w:sz w:val="18"/>
               </w:rPr>
               <w:t>ec_us_cm</w:t>
             </w:r>
-            <w:proofErr w:type="spellEnd"/>
           </w:p>
         </w:tc>
         <w:tc>
@@ -3963,39 +2954,7 @@
                 <w:sz w:val="18"/>
                 <w:lang w:val="es-MX"/>
               </w:rPr>
-              <w:t xml:space="preserve">Conductividad independiente en µS/cm; actualmente </w:t>
-            </w:r>
-            <w:proofErr w:type="spellStart"/>
-            <w:r>
-              <w:rPr>
-                <w:sz w:val="18"/>
-                <w:lang w:val="es-MX"/>
-              </w:rPr>
-              <w:t>null</w:t>
-            </w:r>
-            <w:proofErr w:type="spellEnd"/>
-            <w:r>
-              <w:rPr>
-                <w:sz w:val="18"/>
-                <w:lang w:val="es-MX"/>
-              </w:rPr>
-              <w:t>/</w:t>
-            </w:r>
-            <w:proofErr w:type="spellStart"/>
-            <w:r>
-              <w:rPr>
-                <w:sz w:val="18"/>
-                <w:lang w:val="es-MX"/>
-              </w:rPr>
-              <w:t>unavailable</w:t>
-            </w:r>
-            <w:proofErr w:type="spellEnd"/>
-            <w:r>
-              <w:rPr>
-                <w:sz w:val="18"/>
-                <w:lang w:val="es-MX"/>
-              </w:rPr>
-              <w:t>.</w:t>
+              <w:t>Conductividad independiente en µS/cm; actualmente null/unavailable.</w:t>
             </w:r>
           </w:p>
         </w:tc>
@@ -4051,55 +3010,7 @@
                 <w:sz w:val="18"/>
                 <w:lang w:val="es-MX"/>
               </w:rPr>
-              <w:t xml:space="preserve">Origen por variable: real, </w:t>
-            </w:r>
-            <w:proofErr w:type="spellStart"/>
-            <w:r>
-              <w:rPr>
-                <w:sz w:val="18"/>
-                <w:lang w:val="es-MX"/>
-              </w:rPr>
-              <w:t>simulated</w:t>
-            </w:r>
-            <w:proofErr w:type="spellEnd"/>
-            <w:r>
-              <w:rPr>
-                <w:sz w:val="18"/>
-                <w:lang w:val="es-MX"/>
-              </w:rPr>
-              <w:t xml:space="preserve">, </w:t>
-            </w:r>
-            <w:proofErr w:type="spellStart"/>
-            <w:r>
-              <w:rPr>
-                <w:sz w:val="18"/>
-                <w:lang w:val="es-MX"/>
-              </w:rPr>
-              <w:t>unavailable</w:t>
-            </w:r>
-            <w:proofErr w:type="spellEnd"/>
-            <w:r>
-              <w:rPr>
-                <w:sz w:val="18"/>
-                <w:lang w:val="es-MX"/>
-              </w:rPr>
-              <w:t xml:space="preserve"> o </w:t>
-            </w:r>
-            <w:proofErr w:type="spellStart"/>
-            <w:r>
-              <w:rPr>
-                <w:sz w:val="18"/>
-                <w:lang w:val="es-MX"/>
-              </w:rPr>
-              <w:t>invalid</w:t>
-            </w:r>
-            <w:proofErr w:type="spellEnd"/>
-            <w:r>
-              <w:rPr>
-                <w:sz w:val="18"/>
-                <w:lang w:val="es-MX"/>
-              </w:rPr>
-              <w:t>.</w:t>
+              <w:t>Origen por variable: real, simulated, unavailable o invalid.</w:t>
             </w:r>
           </w:p>
         </w:tc>
@@ -4124,28 +3035,12 @@
             <w:pPr>
               <w:spacing w:before="40" w:after="60" w:line="252" w:lineRule="auto"/>
             </w:pPr>
-            <w:proofErr w:type="spellStart"/>
-            <w:r>
-              <w:rPr>
-                <w:sz w:val="18"/>
-              </w:rPr>
-              <w:t>captured_at</w:t>
-            </w:r>
-            <w:proofErr w:type="spellEnd"/>
-            <w:r>
-              <w:rPr>
-                <w:sz w:val="18"/>
-              </w:rPr>
-              <w:t xml:space="preserve"> y </w:t>
-            </w:r>
-            <w:proofErr w:type="spellStart"/>
-            <w:r>
-              <w:rPr>
-                <w:sz w:val="18"/>
-              </w:rPr>
-              <w:t>created_at</w:t>
-            </w:r>
-            <w:proofErr w:type="spellEnd"/>
+            <w:r>
+              <w:rPr>
+                <w:sz w:val="18"/>
+              </w:rPr>
+              <w:t>captured_at y created_at</w:t>
+            </w:r>
           </w:p>
         </w:tc>
         <w:tc>
@@ -4196,19 +3091,11 @@
             <w:pPr>
               <w:spacing w:before="40" w:after="60" w:line="252" w:lineRule="auto"/>
             </w:pPr>
-            <w:proofErr w:type="spellStart"/>
-            <w:r>
-              <w:rPr>
-                <w:sz w:val="18"/>
-              </w:rPr>
-              <w:t>message_version</w:t>
-            </w:r>
-            <w:proofErr w:type="spellEnd"/>
-            <w:r>
-              <w:rPr>
-                <w:sz w:val="18"/>
-              </w:rPr>
-              <w:t xml:space="preserve"> y reason</w:t>
+            <w:r>
+              <w:rPr>
+                <w:sz w:val="18"/>
+              </w:rPr>
+              <w:t>message_version y reason</w:t>
             </w:r>
           </w:p>
         </w:tc>
@@ -4257,16 +3144,8 @@
         <w:rPr>
           <w:b/>
         </w:rPr>
-        <w:t xml:space="preserve">Consulta de </w:t>
+        <w:t>Consulta de recuperación</w:t>
       </w:r>
-      <w:proofErr w:type="spellStart"/>
-      <w:r>
-        <w:rPr>
-          <w:b/>
-        </w:rPr>
-        <w:t>recuperación</w:t>
-      </w:r>
-      <w:proofErr w:type="spellEnd"/>
     </w:p>
     <w:p>
       <w:pPr>
@@ -4339,21 +3218,7 @@
         <w:rPr>
           <w:lang w:val="es-MX"/>
         </w:rPr>
-        <w:t xml:space="preserve">Android usa el GET de Laravel para obtener esta información; no ejecuta SQL ni recibe credenciales de PostgreSQL. El esquema se conserva en las migraciones, incluida la ampliación v3 de octubre que permite valores </w:t>
-      </w:r>
-      <w:proofErr w:type="spellStart"/>
-      <w:r>
-        <w:rPr>
-          <w:lang w:val="es-MX"/>
-        </w:rPr>
-        <w:t>null</w:t>
-      </w:r>
-      <w:proofErr w:type="spellEnd"/>
-      <w:r>
-        <w:rPr>
-          <w:lang w:val="es-MX"/>
-        </w:rPr>
-        <w:t xml:space="preserve"> y hora de adquisición.</w:t>
+        <w:t>Android usa el GET de Laravel para obtener esta información; no ejecuta SQL ni recibe credenciales de PostgreSQL. El esquema se conserva en las migraciones, incluida la ampliación v3 de octubre que permite valores null y hora de adquisición.</w:t>
       </w:r>
     </w:p>
     <w:p>
@@ -4369,61 +3234,7 @@
           <w:sz w:val="17"/>
           <w:lang w:val="es-MX"/>
         </w:rPr>
-        <w:t xml:space="preserve">Fuentes: </w:t>
-      </w:r>
-      <w:proofErr w:type="spellStart"/>
-      <w:r>
-        <w:rPr>
-          <w:i/>
-          <w:sz w:val="17"/>
-          <w:lang w:val="es-MX"/>
-        </w:rPr>
-        <w:t>hydromate-backend</w:t>
-      </w:r>
-      <w:proofErr w:type="spellEnd"/>
-      <w:r>
-        <w:rPr>
-          <w:i/>
-          <w:sz w:val="17"/>
-          <w:lang w:val="es-MX"/>
-        </w:rPr>
-        <w:t>/</w:t>
-      </w:r>
-      <w:proofErr w:type="spellStart"/>
-      <w:r>
-        <w:rPr>
-          <w:i/>
-          <w:sz w:val="17"/>
-          <w:lang w:val="es-MX"/>
-        </w:rPr>
-        <w:t>database</w:t>
-      </w:r>
-      <w:proofErr w:type="spellEnd"/>
-      <w:r>
-        <w:rPr>
-          <w:i/>
-          <w:sz w:val="17"/>
-          <w:lang w:val="es-MX"/>
-        </w:rPr>
-        <w:t>/</w:t>
-      </w:r>
-      <w:proofErr w:type="spellStart"/>
-      <w:r>
-        <w:rPr>
-          <w:i/>
-          <w:sz w:val="17"/>
-          <w:lang w:val="es-MX"/>
-        </w:rPr>
-        <w:t>migrations</w:t>
-      </w:r>
-      <w:proofErr w:type="spellEnd"/>
-      <w:r>
-        <w:rPr>
-          <w:i/>
-          <w:sz w:val="17"/>
-          <w:lang w:val="es-MX"/>
-        </w:rPr>
-        <w:t>/ y pruebas/esquema-postgresql-2026-10-07.json. El esquema exportado es un antecedente local; las migraciones v3 describen las columnas añadidas posteriormente.</w:t>
+        <w:t>Fuentes: hydromate-backend/database/migrations/ y pruebas/esquema-postgresql-2026-10-07.json. El esquema exportado es un antecedente local; las migraciones v3 describen las columnas añadidas posteriormente.</w:t>
       </w:r>
     </w:p>
     <w:p>
@@ -4453,7 +3264,6 @@
           <w:sz w:val="29"/>
           <w:lang w:val="es-MX"/>
         </w:rPr>
-        <w:lastRenderedPageBreak/>
         <w:t>6. Diez registros reales recuperados</w:t>
       </w:r>
     </w:p>
@@ -4468,35 +3278,7 @@
         <w:rPr>
           <w:lang w:val="es-MX"/>
         </w:rPr>
-        <w:t xml:space="preserve">Esta tabla contiene diez filas obtenidas del </w:t>
-      </w:r>
-      <w:proofErr w:type="spellStart"/>
-      <w:r>
-        <w:rPr>
-          <w:lang w:val="es-MX"/>
-        </w:rPr>
-        <w:t>backend</w:t>
-      </w:r>
-      <w:proofErr w:type="spellEnd"/>
-      <w:r>
-        <w:rPr>
-          <w:lang w:val="es-MX"/>
-        </w:rPr>
-        <w:t xml:space="preserve"> público el 21 de octubre. No son datos escritos a mano para llenar la interfaz: proceden del GET de Laravel, con </w:t>
-      </w:r>
-      <w:proofErr w:type="spellStart"/>
-      <w:r>
-        <w:rPr>
-          <w:lang w:val="es-MX"/>
-        </w:rPr>
-        <w:t>device_id</w:t>
-      </w:r>
-      <w:proofErr w:type="spellEnd"/>
-      <w:r>
-        <w:rPr>
-          <w:lang w:val="es-MX"/>
-        </w:rPr>
-        <w:t xml:space="preserve"> hydromate-01, contrato v3 y origen real en las variables mostradas.</w:t>
+        <w:t>Esta tabla contiene diez filas obtenidas del backend público el 21 de octubre. No son datos escritos a mano para llenar la interfaz: proceden del GET de Laravel, con device_id hydromate-01, contrato v3 y origen real en las variables mostradas.</w:t>
       </w:r>
     </w:p>
     <w:tbl>
@@ -4547,7 +3329,6 @@
               <w:keepNext/>
               <w:spacing w:before="40" w:after="60" w:line="252" w:lineRule="auto"/>
             </w:pPr>
-            <w:proofErr w:type="spellStart"/>
             <w:r>
               <w:rPr>
                 <w:b/>
@@ -4555,7 +3336,6 @@
               </w:rPr>
               <w:t>Secuencia</w:t>
             </w:r>
-            <w:proofErr w:type="spellEnd"/>
           </w:p>
         </w:tc>
         <w:tc>
@@ -6402,77 +5182,7 @@
         <w:rPr>
           <w:lang w:val="es-MX"/>
         </w:rPr>
-        <w:t xml:space="preserve">Fecha: 21 de octubre de 2026. Hora mostrada: </w:t>
-      </w:r>
-      <w:proofErr w:type="spellStart"/>
-      <w:r>
-        <w:rPr>
-          <w:lang w:val="es-MX"/>
-        </w:rPr>
-        <w:t>America</w:t>
-      </w:r>
-      <w:proofErr w:type="spellEnd"/>
-      <w:r>
-        <w:rPr>
-          <w:lang w:val="es-MX"/>
-        </w:rPr>
-        <w:t xml:space="preserve">/Tijuana. En el </w:t>
-      </w:r>
-      <w:proofErr w:type="spellStart"/>
-      <w:r>
-        <w:rPr>
-          <w:lang w:val="es-MX"/>
-        </w:rPr>
-        <w:t>backend</w:t>
-      </w:r>
-      <w:proofErr w:type="spellEnd"/>
-      <w:r>
-        <w:rPr>
-          <w:lang w:val="es-MX"/>
-        </w:rPr>
-        <w:t xml:space="preserve"> las fechas permanecen en UTC. El archivo adjunto conserva 20 filas completas, incluidos id, secuencia, </w:t>
-      </w:r>
-      <w:proofErr w:type="spellStart"/>
-      <w:r>
-        <w:rPr>
-          <w:lang w:val="es-MX"/>
-        </w:rPr>
-        <w:t>captured_at</w:t>
-      </w:r>
-      <w:proofErr w:type="spellEnd"/>
-      <w:r>
-        <w:rPr>
-          <w:lang w:val="es-MX"/>
-        </w:rPr>
-        <w:t xml:space="preserve">, </w:t>
-      </w:r>
-      <w:proofErr w:type="spellStart"/>
-      <w:r>
-        <w:rPr>
-          <w:lang w:val="es-MX"/>
-        </w:rPr>
-        <w:t>created_at</w:t>
-      </w:r>
-      <w:proofErr w:type="spellEnd"/>
-      <w:r>
-        <w:rPr>
-          <w:lang w:val="es-MX"/>
-        </w:rPr>
-        <w:t xml:space="preserve"> y </w:t>
-      </w:r>
-      <w:proofErr w:type="spellStart"/>
-      <w:r>
-        <w:rPr>
-          <w:lang w:val="es-MX"/>
-        </w:rPr>
-        <w:t>sources</w:t>
-      </w:r>
-      <w:proofErr w:type="spellEnd"/>
-      <w:r>
-        <w:rPr>
-          <w:lang w:val="es-MX"/>
-        </w:rPr>
-        <w:t>.</w:t>
+        <w:t>Fecha: 21 de octubre de 2026. Hora mostrada: America/Tijuana. En el backend las fechas permanecen en UTC. El archivo adjunto conserva 20 filas completas, incluidos id, secuencia, captured_at, created_at y sources.</w:t>
       </w:r>
     </w:p>
     <w:p>
@@ -6515,23 +5225,7 @@
           <w:sz w:val="18"/>
         </w:rPr>
         <w:br/>
-        <w:t xml:space="preserve">  "</w:t>
-      </w:r>
-      <w:proofErr w:type="spellStart"/>
-      <w:r>
-        <w:rPr>
-          <w:rFonts w:ascii="Consolas" w:hAnsi="Consolas"/>
-          <w:sz w:val="18"/>
-        </w:rPr>
-        <w:t>device_id</w:t>
-      </w:r>
-      <w:proofErr w:type="spellEnd"/>
-      <w:r>
-        <w:rPr>
-          <w:rFonts w:ascii="Consolas" w:hAnsi="Consolas"/>
-          <w:sz w:val="18"/>
-        </w:rPr>
-        <w:t>": "hydromate-01",</w:t>
+        <w:t xml:space="preserve">  "device_id": "hydromate-01",</w:t>
       </w:r>
       <w:r>
         <w:rPr>
@@ -6625,25 +5319,7 @@
           <w:sz w:val="17"/>
           <w:lang w:val="es-MX"/>
         </w:rPr>
-        <w:t>Evidencia completa: evidencias/registros-</w:t>
-      </w:r>
-      <w:proofErr w:type="spellStart"/>
-      <w:r>
-        <w:rPr>
-          <w:i/>
-          <w:sz w:val="17"/>
-          <w:lang w:val="es-MX"/>
-        </w:rPr>
-        <w:t>publicos.json</w:t>
-      </w:r>
-      <w:proofErr w:type="spellEnd"/>
-      <w:r>
-        <w:rPr>
-          <w:i/>
-          <w:sz w:val="17"/>
-          <w:lang w:val="es-MX"/>
-        </w:rPr>
-        <w:t>.</w:t>
+        <w:t>Evidencia completa: evidencias/registros-publicos.json.</w:t>
       </w:r>
     </w:p>
     <w:p>
@@ -6673,7 +5349,6 @@
           <w:sz w:val="29"/>
           <w:lang w:val="es-MX"/>
         </w:rPr>
-        <w:lastRenderedPageBreak/>
         <w:t>7. La aplicación Android con datos reales</w:t>
       </w:r>
     </w:p>
@@ -6688,21 +5363,7 @@
         <w:rPr>
           <w:lang w:val="es-MX"/>
         </w:rPr>
-        <w:t xml:space="preserve">Inicio presenta la lectura más reciente y su fecha. Historial reúne las recepciones guardadas y permite ver una gráfica sencilla. Ambas pantallas consultan al </w:t>
-      </w:r>
-      <w:proofErr w:type="spellStart"/>
-      <w:r>
-        <w:rPr>
-          <w:lang w:val="es-MX"/>
-        </w:rPr>
-        <w:t>backend</w:t>
-      </w:r>
-      <w:proofErr w:type="spellEnd"/>
-      <w:r>
-        <w:rPr>
-          <w:lang w:val="es-MX"/>
-        </w:rPr>
-        <w:t xml:space="preserve"> HTTPS; producción no sustituye fallos por datos de demostración.</w:t>
+        <w:t>Inicio presenta la lectura más reciente y su fecha. Historial reúne las recepciones guardadas y permite ver una gráfica sencilla. Ambas pantallas consultan al backend HTTPS; producción no sustituye fallos por datos de demostración.</w:t>
       </w:r>
     </w:p>
     <w:p>
@@ -6826,147 +5487,13 @@
         <w:rPr>
           <w:lang w:val="es-MX"/>
         </w:rPr>
-        <w:t xml:space="preserve">La </w:t>
+        <w:t>La app</w:t>
       </w:r>
-      <w:proofErr w:type="gramStart"/>
       <w:r>
         <w:rPr>
           <w:lang w:val="es-MX"/>
         </w:rPr>
-        <w:t>app</w:t>
-      </w:r>
-      <w:proofErr w:type="gramEnd"/>
-      <w:r>
-        <w:rPr>
-          <w:lang w:val="es-MX"/>
-        </w:rPr>
-        <w:t xml:space="preserve"> maneja estados de carga, ausencia de lecturas y error de comunicación. Las variables opcionales pueden aparecer sin lectura; no se convierten en cero. Los estados están implementados en </w:t>
-      </w:r>
-      <w:proofErr w:type="spellStart"/>
-      <w:r>
-        <w:rPr>
-          <w:lang w:val="es-MX"/>
-        </w:rPr>
-        <w:t>mobile</w:t>
-      </w:r>
-      <w:proofErr w:type="spellEnd"/>
-      <w:r>
-        <w:rPr>
-          <w:lang w:val="es-MX"/>
-        </w:rPr>
-        <w:t>/</w:t>
-      </w:r>
-      <w:proofErr w:type="gramStart"/>
-      <w:r>
-        <w:rPr>
-          <w:lang w:val="es-MX"/>
-        </w:rPr>
-        <w:t>app</w:t>
-      </w:r>
-      <w:proofErr w:type="gramEnd"/>
-      <w:r>
-        <w:rPr>
-          <w:lang w:val="es-MX"/>
-        </w:rPr>
-        <w:t>/</w:t>
-      </w:r>
-      <w:proofErr w:type="spellStart"/>
-      <w:r>
-        <w:rPr>
-          <w:lang w:val="es-MX"/>
-        </w:rPr>
-        <w:t>src</w:t>
-      </w:r>
-      <w:proofErr w:type="spellEnd"/>
-      <w:r>
-        <w:rPr>
-          <w:lang w:val="es-MX"/>
-        </w:rPr>
-        <w:t>/</w:t>
-      </w:r>
-      <w:proofErr w:type="spellStart"/>
-      <w:r>
-        <w:rPr>
-          <w:lang w:val="es-MX"/>
-        </w:rPr>
-        <w:t>main</w:t>
-      </w:r>
-      <w:proofErr w:type="spellEnd"/>
-      <w:r>
-        <w:rPr>
-          <w:lang w:val="es-MX"/>
-        </w:rPr>
-        <w:t>/java/</w:t>
-      </w:r>
-      <w:proofErr w:type="spellStart"/>
-      <w:r>
-        <w:rPr>
-          <w:lang w:val="es-MX"/>
-        </w:rPr>
-        <w:t>com</w:t>
-      </w:r>
-      <w:proofErr w:type="spellEnd"/>
-      <w:r>
-        <w:rPr>
-          <w:lang w:val="es-MX"/>
-        </w:rPr>
-        <w:t>/</w:t>
-      </w:r>
-      <w:proofErr w:type="spellStart"/>
-      <w:r>
-        <w:rPr>
-          <w:lang w:val="es-MX"/>
-        </w:rPr>
-        <w:t>hydromate</w:t>
-      </w:r>
-      <w:proofErr w:type="spellEnd"/>
-      <w:r>
-        <w:rPr>
-          <w:lang w:val="es-MX"/>
-        </w:rPr>
-        <w:t>/</w:t>
-      </w:r>
-      <w:proofErr w:type="spellStart"/>
-      <w:r>
-        <w:rPr>
-          <w:lang w:val="es-MX"/>
-        </w:rPr>
-        <w:t>mobile</w:t>
-      </w:r>
-      <w:proofErr w:type="spellEnd"/>
-      <w:r>
-        <w:rPr>
-          <w:lang w:val="es-MX"/>
-        </w:rPr>
-        <w:t>/</w:t>
-      </w:r>
-      <w:proofErr w:type="spellStart"/>
-      <w:r>
-        <w:rPr>
-          <w:lang w:val="es-MX"/>
-        </w:rPr>
-        <w:t>ui</w:t>
-      </w:r>
-      <w:proofErr w:type="spellEnd"/>
-      <w:r>
-        <w:rPr>
-          <w:lang w:val="es-MX"/>
-        </w:rPr>
-        <w:t>/</w:t>
-      </w:r>
-      <w:proofErr w:type="spellStart"/>
-      <w:r>
-        <w:rPr>
-          <w:lang w:val="es-MX"/>
-        </w:rPr>
-        <w:t>ReadingState.kt</w:t>
-      </w:r>
-      <w:proofErr w:type="spellEnd"/>
-      <w:r>
-        <w:rPr>
-          <w:lang w:val="es-MX"/>
-        </w:rPr>
-        <w:t xml:space="preserve"> y comprobados por las pruebas Android.</w:t>
+        <w:t xml:space="preserve"> maneja estados de carga, ausencia de lecturas y error de comunicación. Las variables opcionales pueden aparecer sin lectura; no se convierten en cero. Los estados están implementados en mobile/app/src/main/java/com/hydromate/mobile/ui/ReadingState.kt y comprobados por las pruebas Android.</w:t>
       </w:r>
     </w:p>
     <w:p>
@@ -6982,133 +5509,7 @@
           <w:sz w:val="17"/>
           <w:lang w:val="es-MX"/>
         </w:rPr>
-        <w:t xml:space="preserve">En esa misma base de código, </w:t>
-      </w:r>
-      <w:proofErr w:type="spellStart"/>
-      <w:r>
-        <w:rPr>
-          <w:i/>
-          <w:sz w:val="17"/>
-          <w:lang w:val="es-MX"/>
-        </w:rPr>
-        <w:t>Telemetry.kt</w:t>
-      </w:r>
-      <w:proofErr w:type="spellEnd"/>
-      <w:r>
-        <w:rPr>
-          <w:i/>
-          <w:sz w:val="17"/>
-          <w:lang w:val="es-MX"/>
-        </w:rPr>
-        <w:t xml:space="preserve"> consulta e interpreta la API; </w:t>
-      </w:r>
-      <w:proofErr w:type="spellStart"/>
-      <w:r>
-        <w:rPr>
-          <w:i/>
-          <w:sz w:val="17"/>
-          <w:lang w:val="es-MX"/>
-        </w:rPr>
-        <w:t>ui</w:t>
-      </w:r>
-      <w:proofErr w:type="spellEnd"/>
-      <w:r>
-        <w:rPr>
-          <w:i/>
-          <w:sz w:val="17"/>
-          <w:lang w:val="es-MX"/>
-        </w:rPr>
-        <w:t>/</w:t>
-      </w:r>
-      <w:proofErr w:type="spellStart"/>
-      <w:r>
-        <w:rPr>
-          <w:i/>
-          <w:sz w:val="17"/>
-          <w:lang w:val="es-MX"/>
-        </w:rPr>
-        <w:t>dashboard</w:t>
-      </w:r>
-      <w:proofErr w:type="spellEnd"/>
-      <w:r>
-        <w:rPr>
-          <w:i/>
-          <w:sz w:val="17"/>
-          <w:lang w:val="es-MX"/>
-        </w:rPr>
-        <w:t>/</w:t>
-      </w:r>
-      <w:proofErr w:type="spellStart"/>
-      <w:r>
-        <w:rPr>
-          <w:i/>
-          <w:sz w:val="17"/>
-          <w:lang w:val="es-MX"/>
-        </w:rPr>
-        <w:t>DashboardScreen.kt</w:t>
-      </w:r>
-      <w:proofErr w:type="spellEnd"/>
-      <w:r>
-        <w:rPr>
-          <w:i/>
-          <w:sz w:val="17"/>
-          <w:lang w:val="es-MX"/>
-        </w:rPr>
-        <w:t xml:space="preserve"> muestra la última lectura y </w:t>
-      </w:r>
-      <w:proofErr w:type="spellStart"/>
-      <w:r>
-        <w:rPr>
-          <w:i/>
-          <w:sz w:val="17"/>
-          <w:lang w:val="es-MX"/>
-        </w:rPr>
-        <w:t>ui</w:t>
-      </w:r>
-      <w:proofErr w:type="spellEnd"/>
-      <w:r>
-        <w:rPr>
-          <w:i/>
-          <w:sz w:val="17"/>
-          <w:lang w:val="es-MX"/>
-        </w:rPr>
-        <w:t>/</w:t>
-      </w:r>
-      <w:proofErr w:type="spellStart"/>
-      <w:r>
-        <w:rPr>
-          <w:i/>
-          <w:sz w:val="17"/>
-          <w:lang w:val="es-MX"/>
-        </w:rPr>
-        <w:t>history</w:t>
-      </w:r>
-      <w:proofErr w:type="spellEnd"/>
-      <w:r>
-        <w:rPr>
-          <w:i/>
-          <w:sz w:val="17"/>
-          <w:lang w:val="es-MX"/>
-        </w:rPr>
-        <w:t>/</w:t>
-      </w:r>
-      <w:proofErr w:type="spellStart"/>
-      <w:r>
-        <w:rPr>
-          <w:i/>
-          <w:sz w:val="17"/>
-          <w:lang w:val="es-MX"/>
-        </w:rPr>
-        <w:t>HistoryScreen.kt</w:t>
-      </w:r>
-      <w:proofErr w:type="spellEnd"/>
-      <w:r>
-        <w:rPr>
-          <w:i/>
-          <w:sz w:val="17"/>
-          <w:lang w:val="es-MX"/>
-        </w:rPr>
-        <w:t xml:space="preserve"> presenta los datos almacenados.</w:t>
+        <w:t>En esa misma base de código, Telemetry.kt consulta e interpreta la API; ui/dashboard/DashboardScreen.kt muestra la última lectura y ui/history/HistoryScreen.kt presenta los datos almacenados.</w:t>
       </w:r>
     </w:p>
     <w:p>
@@ -7138,7 +5539,6 @@
           <w:sz w:val="29"/>
           <w:lang w:val="es-MX"/>
         </w:rPr>
-        <w:lastRenderedPageBreak/>
         <w:t>8. Transmisiones consecutivas y tiempos</w:t>
       </w:r>
     </w:p>
@@ -7201,7 +5601,6 @@
               <w:keepNext/>
               <w:spacing w:before="40" w:after="60" w:line="252" w:lineRule="auto"/>
             </w:pPr>
-            <w:proofErr w:type="spellStart"/>
             <w:r>
               <w:rPr>
                 <w:b/>
@@ -7209,7 +5608,6 @@
               </w:rPr>
               <w:t>Secuencia</w:t>
             </w:r>
-            <w:proofErr w:type="spellEnd"/>
           </w:p>
         </w:tc>
         <w:tc>
@@ -8680,21 +7078,7 @@
         <w:rPr>
           <w:lang w:val="es-MX"/>
         </w:rPr>
-        <w:t xml:space="preserve">En ese primer ensayo TDS y temperatura todavía figuraban ausentes o inválidos; eso no elimina las mediciones físicas de luz, pH y flotador. Un ensayo posterior incorporó TDS y </w:t>
-      </w:r>
-      <w:proofErr w:type="gramStart"/>
-      <w:r>
-        <w:rPr>
-          <w:lang w:val="es-MX"/>
-        </w:rPr>
-        <w:t>temperatura reales</w:t>
-      </w:r>
-      <w:proofErr w:type="gramEnd"/>
-      <w:r>
-        <w:rPr>
-          <w:lang w:val="es-MX"/>
-        </w:rPr>
-        <w:t xml:space="preserve"> y quedó comparado con API y Android.</w:t>
+        <w:t>En ese primer ensayo TDS y temperatura todavía figuraban ausentes o inválidos; eso no elimina las mediciones físicas de luz, pH y flotador. Un ensayo posterior incorporó TDS y temperatura reales y quedó comparado con API y Android.</w:t>
       </w:r>
     </w:p>
     <w:tbl>
@@ -8741,31 +7125,13 @@
               <w:keepNext/>
               <w:spacing w:before="40" w:after="60" w:line="252" w:lineRule="auto"/>
             </w:pPr>
-            <w:proofErr w:type="spellStart"/>
             <w:r>
               <w:rPr>
                 <w:b/>
                 <w:sz w:val="18"/>
               </w:rPr>
-              <w:t>Tramo</w:t>
-            </w:r>
-            <w:proofErr w:type="spellEnd"/>
-            <w:r>
-              <w:rPr>
-                <w:b/>
-                <w:sz w:val="18"/>
-              </w:rPr>
-              <w:t xml:space="preserve"> </w:t>
-            </w:r>
-            <w:proofErr w:type="spellStart"/>
-            <w:r>
-              <w:rPr>
-                <w:b/>
-                <w:sz w:val="18"/>
-              </w:rPr>
-              <w:t>medido</w:t>
-            </w:r>
-            <w:proofErr w:type="spellEnd"/>
+              <w:t>Tramo medido</w:t>
+            </w:r>
           </w:p>
         </w:tc>
         <w:tc>
@@ -9007,19 +7373,11 @@
             <w:pPr>
               <w:spacing w:before="40" w:after="60" w:line="252" w:lineRule="auto"/>
             </w:pPr>
-            <w:proofErr w:type="spellStart"/>
-            <w:r>
-              <w:rPr>
-                <w:sz w:val="18"/>
-              </w:rPr>
-              <w:t>Ensayo</w:t>
-            </w:r>
-            <w:proofErr w:type="spellEnd"/>
-            <w:r>
-              <w:rPr>
-                <w:sz w:val="18"/>
-              </w:rPr>
-              <w:t xml:space="preserve"> local anterior</w:t>
+            <w:r>
+              <w:rPr>
+                <w:sz w:val="18"/>
+              </w:rPr>
+              <w:t>Ensayo local anterior</w:t>
             </w:r>
           </w:p>
         </w:tc>
@@ -9073,23 +7431,7 @@
                 <w:sz w:val="18"/>
                 <w:lang w:val="es-MX"/>
               </w:rPr>
-              <w:t xml:space="preserve">Antecedente local con apertura de </w:t>
-            </w:r>
-            <w:proofErr w:type="gramStart"/>
-            <w:r>
-              <w:rPr>
-                <w:sz w:val="18"/>
-                <w:lang w:val="es-MX"/>
-              </w:rPr>
-              <w:t>app</w:t>
-            </w:r>
-            <w:proofErr w:type="gramEnd"/>
-            <w:r>
-              <w:rPr>
-                <w:sz w:val="18"/>
-                <w:lang w:val="es-MX"/>
-              </w:rPr>
-              <w:t xml:space="preserve"> e inspección USB; no se presenta como medición de nube.</w:t>
+              <w:t>Antecedente local con apertura de app e inspección USB; no se presenta como medición de nube.</w:t>
             </w:r>
           </w:p>
         </w:tc>
@@ -9116,43 +7458,7 @@
           <w:sz w:val="17"/>
           <w:lang w:val="es-MX"/>
         </w:rPr>
-        <w:t xml:space="preserve">Fuentes: </w:t>
-      </w:r>
-      <w:proofErr w:type="spellStart"/>
-      <w:r>
-        <w:rPr>
-          <w:i/>
-          <w:sz w:val="17"/>
-          <w:lang w:val="es-MX"/>
-        </w:rPr>
-        <w:t>docs</w:t>
-      </w:r>
-      <w:proofErr w:type="spellEnd"/>
-      <w:r>
-        <w:rPr>
-          <w:i/>
-          <w:sz w:val="17"/>
-          <w:lang w:val="es-MX"/>
-        </w:rPr>
-        <w:t>/</w:t>
-      </w:r>
-      <w:proofErr w:type="spellStart"/>
-      <w:r>
-        <w:rPr>
-          <w:i/>
-          <w:sz w:val="17"/>
-          <w:lang w:val="es-MX"/>
-        </w:rPr>
-        <w:t>evidence</w:t>
-      </w:r>
-      <w:proofErr w:type="spellEnd"/>
-      <w:r>
-        <w:rPr>
-          <w:i/>
-          <w:sz w:val="17"/>
-          <w:lang w:val="es-MX"/>
-        </w:rPr>
-        <w:t>/public-flow-esp32-android-2026-10-21.json y pruebas/latencia-android-reintento-2026-10-07.json.</w:t>
+        <w:t>Fuentes: docs/evidence/public-flow-esp32-android-2026-10-21.json y pruebas/latencia-android-reintento-2026-10-07.json.</w:t>
       </w:r>
     </w:p>
     <w:p>
@@ -9182,7 +7488,6 @@
           <w:sz w:val="29"/>
           <w:lang w:val="es-MX"/>
         </w:rPr>
-        <w:lastRenderedPageBreak/>
         <w:t>9. Pruebas de errores y correcciones</w:t>
       </w:r>
     </w:p>
@@ -9244,7 +7549,6 @@
               <w:keepNext/>
               <w:spacing w:before="40" w:after="60" w:line="252" w:lineRule="auto"/>
             </w:pPr>
-            <w:proofErr w:type="spellStart"/>
             <w:r>
               <w:rPr>
                 <w:b/>
@@ -9252,7 +7556,6 @@
               </w:rPr>
               <w:t>Situación</w:t>
             </w:r>
-            <w:proofErr w:type="spellEnd"/>
           </w:p>
         </w:tc>
         <w:tc>
@@ -9359,23 +7662,7 @@
                 <w:sz w:val="18"/>
                 <w:lang w:val="es-MX"/>
               </w:rPr>
-              <w:t xml:space="preserve">HTTP 422 y ACK </w:t>
-            </w:r>
-            <w:proofErr w:type="spellStart"/>
-            <w:r>
-              <w:rPr>
-                <w:sz w:val="18"/>
-                <w:lang w:val="es-MX"/>
-              </w:rPr>
-              <w:t>rejected</w:t>
-            </w:r>
-            <w:proofErr w:type="spellEnd"/>
-            <w:r>
-              <w:rPr>
-                <w:sz w:val="18"/>
-                <w:lang w:val="es-MX"/>
-              </w:rPr>
-              <w:t xml:space="preserve"> en el ensayo MQTT local.</w:t>
+              <w:t>HTTP 422 y ACK rejected en el ensayo MQTT local.</w:t>
             </w:r>
           </w:p>
         </w:tc>
@@ -9427,28 +7714,12 @@
             <w:pPr>
               <w:spacing w:before="40" w:after="60" w:line="252" w:lineRule="auto"/>
             </w:pPr>
-            <w:proofErr w:type="spellStart"/>
-            <w:r>
-              <w:rPr>
-                <w:sz w:val="18"/>
-              </w:rPr>
-              <w:t>Reenvío</w:t>
-            </w:r>
-            <w:proofErr w:type="spellEnd"/>
-            <w:r>
-              <w:rPr>
-                <w:sz w:val="18"/>
-              </w:rPr>
-              <w:t xml:space="preserve"> </w:t>
-            </w:r>
-            <w:proofErr w:type="spellStart"/>
-            <w:r>
-              <w:rPr>
-                <w:sz w:val="18"/>
-              </w:rPr>
-              <w:t>idéntico</w:t>
-            </w:r>
-            <w:proofErr w:type="spellEnd"/>
+            <w:r>
+              <w:rPr>
+                <w:sz w:val="18"/>
+              </w:rPr>
+              <w:t>Reenvío idéntico</w:t>
+            </w:r>
           </w:p>
         </w:tc>
         <w:tc>
@@ -9474,23 +7745,7 @@
                 <w:sz w:val="18"/>
                 <w:lang w:val="es-MX"/>
               </w:rPr>
-              <w:t xml:space="preserve">ACK </w:t>
-            </w:r>
-            <w:proofErr w:type="spellStart"/>
-            <w:r>
-              <w:rPr>
-                <w:sz w:val="18"/>
-                <w:lang w:val="es-MX"/>
-              </w:rPr>
-              <w:t>stored</w:t>
-            </w:r>
-            <w:proofErr w:type="spellEnd"/>
-            <w:r>
-              <w:rPr>
-                <w:sz w:val="18"/>
-                <w:lang w:val="es-MX"/>
-              </w:rPr>
-              <w:t xml:space="preserve"> sin otra fila para la misma identidad.</w:t>
+              <w:t>ACK stored sin otra fila para la misma identidad.</w:t>
             </w:r>
           </w:p>
         </w:tc>
@@ -9572,21 +7827,12 @@
                 <w:lang w:val="es-MX"/>
               </w:rPr>
             </w:pPr>
-            <w:proofErr w:type="spellStart"/>
-            <w:r>
-              <w:rPr>
-                <w:sz w:val="18"/>
-                <w:lang w:val="es-MX"/>
-              </w:rPr>
-              <w:t>conflict</w:t>
-            </w:r>
-            <w:proofErr w:type="spellEnd"/>
-            <w:r>
-              <w:rPr>
-                <w:sz w:val="18"/>
-                <w:lang w:val="es-MX"/>
-              </w:rPr>
-              <w:t>; no sobrescribe la primera medición.</w:t>
+            <w:r>
+              <w:rPr>
+                <w:sz w:val="18"/>
+                <w:lang w:val="es-MX"/>
+              </w:rPr>
+              <w:t>conflict; no sobrescribe la primera medición.</w:t>
             </w:r>
           </w:p>
         </w:tc>
@@ -9725,28 +7971,12 @@
             <w:pPr>
               <w:spacing w:before="40" w:after="60" w:line="252" w:lineRule="auto"/>
             </w:pPr>
-            <w:proofErr w:type="spellStart"/>
-            <w:r>
-              <w:rPr>
-                <w:sz w:val="18"/>
-              </w:rPr>
-              <w:t>Credenciales</w:t>
-            </w:r>
-            <w:proofErr w:type="spellEnd"/>
-            <w:r>
-              <w:rPr>
-                <w:sz w:val="18"/>
-              </w:rPr>
-              <w:t xml:space="preserve"> MQTT </w:t>
-            </w:r>
-            <w:proofErr w:type="spellStart"/>
-            <w:r>
-              <w:rPr>
-                <w:sz w:val="18"/>
-              </w:rPr>
-              <w:t>desalineadas</w:t>
-            </w:r>
-            <w:proofErr w:type="spellEnd"/>
+            <w:r>
+              <w:rPr>
+                <w:sz w:val="18"/>
+              </w:rPr>
+              <w:t>Credenciales MQTT desalineadas</w:t>
+            </w:r>
           </w:p>
         </w:tc>
         <w:tc>
@@ -9795,7 +8025,14 @@
                 <w:sz w:val="18"/>
                 <w:lang w:val="es-MX"/>
               </w:rPr>
-              <w:t>Responsable sincronizó las cuentas; conexión y suscripción confirmadas.</w:t>
+              <w:t>Se sincronizaron las cuentas;</w:t>
+            </w:r>
+            <w:r>
+              <w:rPr>
+                <w:sz w:val="18"/>
+                <w:lang w:val="es-MX"/>
+              </w:rPr>
+              <w:t xml:space="preserve"> conexión y suscripción confirmadas.</w:t>
             </w:r>
           </w:p>
         </w:tc>
@@ -9911,16 +8148,8 @@
               <w:rPr>
                 <w:sz w:val="18"/>
               </w:rPr>
-              <w:t xml:space="preserve">Primer sensor TDS </w:t>
-            </w:r>
-            <w:proofErr w:type="spellStart"/>
-            <w:r>
-              <w:rPr>
-                <w:sz w:val="18"/>
-              </w:rPr>
-              <w:t>defectuoso</w:t>
-            </w:r>
-            <w:proofErr w:type="spellEnd"/>
+              <w:t>Primer sensor TDS defectuoso</w:t>
+            </w:r>
           </w:p>
         </w:tc>
         <w:tc>
@@ -9998,42 +8227,12 @@
             <w:pPr>
               <w:spacing w:before="40" w:after="60" w:line="252" w:lineRule="auto"/>
             </w:pPr>
-            <w:proofErr w:type="spellStart"/>
-            <w:r>
-              <w:rPr>
-                <w:sz w:val="18"/>
-              </w:rPr>
-              <w:t>Temperatura</w:t>
-            </w:r>
-            <w:proofErr w:type="spellEnd"/>
-            <w:r>
-              <w:rPr>
-                <w:sz w:val="18"/>
-              </w:rPr>
-              <w:t xml:space="preserve"> </w:t>
-            </w:r>
-            <w:proofErr w:type="spellStart"/>
-            <w:r>
-              <w:rPr>
-                <w:sz w:val="18"/>
-              </w:rPr>
-              <w:t>inicialmente</w:t>
-            </w:r>
-            <w:proofErr w:type="spellEnd"/>
-            <w:r>
-              <w:rPr>
-                <w:sz w:val="18"/>
-              </w:rPr>
-              <w:t xml:space="preserve"> </w:t>
-            </w:r>
-            <w:proofErr w:type="spellStart"/>
-            <w:r>
-              <w:rPr>
-                <w:sz w:val="18"/>
-              </w:rPr>
-              <w:t>inválida</w:t>
-            </w:r>
-            <w:proofErr w:type="spellEnd"/>
+            <w:r>
+              <w:rPr>
+                <w:sz w:val="18"/>
+              </w:rPr>
+              <w:t>Temperatura inicialmente inválida</w:t>
+            </w:r>
           </w:p>
         </w:tc>
         <w:tc>
@@ -10059,23 +8258,7 @@
                 <w:sz w:val="18"/>
                 <w:lang w:val="es-MX"/>
               </w:rPr>
-              <w:t xml:space="preserve">Campo </w:t>
-            </w:r>
-            <w:proofErr w:type="spellStart"/>
-            <w:r>
-              <w:rPr>
-                <w:sz w:val="18"/>
-                <w:lang w:val="es-MX"/>
-              </w:rPr>
-              <w:t>null</w:t>
-            </w:r>
-            <w:proofErr w:type="spellEnd"/>
-            <w:r>
-              <w:rPr>
-                <w:sz w:val="18"/>
-                <w:lang w:val="es-MX"/>
-              </w:rPr>
-              <w:t xml:space="preserve"> en la evidencia inicial.</w:t>
+              <w:t>Campo null en la evidencia inicial.</w:t>
             </w:r>
           </w:p>
         </w:tc>
@@ -10128,58 +8311,7 @@
           <w:b/>
           <w:lang w:val="es-MX"/>
         </w:rPr>
-        <w:t xml:space="preserve">Respuesta comprensible del </w:t>
-      </w:r>
-      <w:proofErr w:type="spellStart"/>
-      <w:r>
-        <w:rPr>
-          <w:b/>
-          <w:lang w:val="es-MX"/>
-        </w:rPr>
-        <w:t>backend</w:t>
-      </w:r>
-      <w:proofErr w:type="spellEnd"/>
-    </w:p>
-    <w:p>
-      <w:pPr>
-        <w:spacing w:after="100" w:line="252" w:lineRule="auto"/>
-        <w:rPr>
-          <w:lang w:val="es-MX"/>
-        </w:rPr>
-      </w:pPr>
-      <w:r>
-        <w:rPr>
-          <w:lang w:val="es-MX"/>
-        </w:rPr>
-        <w:t>Una lectura correcta devuelve HTTP 201 con el mensaje “</w:t>
-      </w:r>
-      <w:proofErr w:type="spellStart"/>
-      <w:r>
-        <w:rPr>
-          <w:lang w:val="es-MX"/>
-        </w:rPr>
-        <w:t>Medicion</w:t>
-      </w:r>
-      <w:proofErr w:type="spellEnd"/>
-      <w:r>
-        <w:rPr>
-          <w:lang w:val="es-MX"/>
-        </w:rPr>
-        <w:t xml:space="preserve"> registrada correctamente”. Una lectura fuera de rango devuelve HTTP 422 con errores del campo afectado. Un duplicado devuelve HTTP 409 con “</w:t>
-      </w:r>
-      <w:proofErr w:type="spellStart"/>
-      <w:r>
-        <w:rPr>
-          <w:lang w:val="es-MX"/>
-        </w:rPr>
-        <w:t>Medicion</w:t>
-      </w:r>
-      <w:proofErr w:type="spellEnd"/>
-      <w:r>
-        <w:rPr>
-          <w:lang w:val="es-MX"/>
-        </w:rPr>
-        <w:t xml:space="preserve"> duplicada”. El bridge transforma esos resultados en confirmaciones que el ESP32 puede distinguir.</w:t>
+        <w:t>Respuesta comprensible del backend</w:t>
       </w:r>
     </w:p>
     <w:p>
@@ -10193,58 +8325,28 @@
         <w:rPr>
           <w:lang w:val="es-MX"/>
         </w:rPr>
-        <w:t xml:space="preserve">Se ejecutaron además 29 pruebas del </w:t>
+        <w:t>Una lectura correcta devuelve HTTP 201 con el mensaje “Medicion</w:t>
       </w:r>
-      <w:proofErr w:type="spellStart"/>
       <w:r>
         <w:rPr>
           <w:lang w:val="es-MX"/>
         </w:rPr>
-        <w:t>backend</w:t>
+        <w:t xml:space="preserve"> registrada correctamente”. Una lectura fuera de rango devuelve HTTP 422 con errores del campo afectado. Un duplicado devuelve HTTP 409 con “Medicion duplicada”. El bridge transforma esos resultados en confirmaciones que el ESP32 puede distinguir.</w:t>
       </w:r>
-      <w:proofErr w:type="spellEnd"/>
+    </w:p>
+    <w:p>
+      <w:pPr>
+        <w:spacing w:after="100" w:line="252" w:lineRule="auto"/>
+        <w:rPr>
+          <w:lang w:val="es-MX"/>
+        </w:rPr>
+      </w:pPr>
       <w:r>
         <w:rPr>
           <w:lang w:val="es-MX"/>
         </w:rPr>
-        <w:t xml:space="preserve"> con 194 comprobaciones, 10 pruebas Python y pruebas C++ de conversión y cambios. Android compiló en </w:t>
+        <w:t>Se ejecutaron además 29 pruebas del backend con 194 comprobaciones, 10 pruebas Python y pruebas C++ de conversión y cambios. Android compiló en debug/release, pasó lint</w:t>
       </w:r>
-      <w:proofErr w:type="spellStart"/>
-      <w:r>
-        <w:rPr>
-          <w:lang w:val="es-MX"/>
-        </w:rPr>
-        <w:t>debug</w:t>
-      </w:r>
-      <w:proofErr w:type="spellEnd"/>
-      <w:r>
-        <w:rPr>
-          <w:lang w:val="es-MX"/>
-        </w:rPr>
-        <w:t>/</w:t>
-      </w:r>
-      <w:proofErr w:type="spellStart"/>
-      <w:r>
-        <w:rPr>
-          <w:lang w:val="es-MX"/>
-        </w:rPr>
-        <w:t>release</w:t>
-      </w:r>
-      <w:proofErr w:type="spellEnd"/>
-      <w:r>
-        <w:rPr>
-          <w:lang w:val="es-MX"/>
-        </w:rPr>
-        <w:t xml:space="preserve">, pasó </w:t>
-      </w:r>
-      <w:proofErr w:type="spellStart"/>
-      <w:r>
-        <w:rPr>
-          <w:lang w:val="es-MX"/>
-        </w:rPr>
-        <w:t>lint</w:t>
-      </w:r>
-      <w:proofErr w:type="spellEnd"/>
       <w:r>
         <w:rPr>
           <w:lang w:val="es-MX"/>
@@ -10326,31 +8428,13 @@
               <w:keepNext/>
               <w:spacing w:before="40" w:after="60" w:line="252" w:lineRule="auto"/>
             </w:pPr>
-            <w:proofErr w:type="spellStart"/>
             <w:r>
               <w:rPr>
                 <w:b/>
                 <w:sz w:val="18"/>
               </w:rPr>
-              <w:t>Periodo</w:t>
-            </w:r>
-            <w:proofErr w:type="spellEnd"/>
-            <w:r>
-              <w:rPr>
-                <w:b/>
-                <w:sz w:val="18"/>
-              </w:rPr>
-              <w:t xml:space="preserve"> </w:t>
-            </w:r>
-            <w:proofErr w:type="spellStart"/>
-            <w:r>
-              <w:rPr>
-                <w:b/>
-                <w:sz w:val="18"/>
-              </w:rPr>
-              <w:t>transcurrido</w:t>
-            </w:r>
-            <w:proofErr w:type="spellEnd"/>
+              <w:t>Periodo transcurrido</w:t>
+            </w:r>
           </w:p>
         </w:tc>
         <w:tc>
@@ -10460,16 +8544,8 @@
               <w:rPr>
                 <w:sz w:val="18"/>
               </w:rPr>
-              <w:t xml:space="preserve">Finales de </w:t>
-            </w:r>
-            <w:proofErr w:type="spellStart"/>
-            <w:r>
-              <w:rPr>
-                <w:sz w:val="18"/>
-              </w:rPr>
-              <w:t>septiembre</w:t>
-            </w:r>
-            <w:proofErr w:type="spellEnd"/>
+              <w:t>Finales de septiembre</w:t>
+            </w:r>
           </w:p>
         </w:tc>
         <w:tc>
@@ -10524,16 +8600,8 @@
               <w:rPr>
                 <w:sz w:val="18"/>
               </w:rPr>
-              <w:t xml:space="preserve">3–7 </w:t>
-            </w:r>
-            <w:proofErr w:type="spellStart"/>
-            <w:r>
-              <w:rPr>
-                <w:sz w:val="18"/>
-              </w:rPr>
-              <w:t>octubre</w:t>
-            </w:r>
-            <w:proofErr w:type="spellEnd"/>
+              <w:t>3–7 octubre</w:t>
+            </w:r>
           </w:p>
         </w:tc>
         <w:tc>
@@ -10588,17 +8656,8 @@
               <w:rPr>
                 <w:sz w:val="18"/>
               </w:rPr>
-              <w:lastRenderedPageBreak/>
-              <w:t xml:space="preserve">14–21 </w:t>
-            </w:r>
-            <w:proofErr w:type="spellStart"/>
-            <w:r>
-              <w:rPr>
-                <w:sz w:val="18"/>
-              </w:rPr>
-              <w:t>octubre</w:t>
-            </w:r>
-            <w:proofErr w:type="spellEnd"/>
+              <w:t>14–21 octubre</w:t>
+            </w:r>
           </w:p>
         </w:tc>
         <w:tc>
@@ -10624,23 +8683,7 @@
                 <w:sz w:val="18"/>
                 <w:lang w:val="es-MX"/>
               </w:rPr>
-              <w:t xml:space="preserve">Empaquetado de producción, VPS </w:t>
-            </w:r>
-            <w:proofErr w:type="spellStart"/>
-            <w:r>
-              <w:rPr>
-                <w:sz w:val="18"/>
-                <w:lang w:val="es-MX"/>
-              </w:rPr>
-              <w:t>rootless</w:t>
-            </w:r>
-            <w:proofErr w:type="spellEnd"/>
-            <w:r>
-              <w:rPr>
-                <w:sz w:val="18"/>
-                <w:lang w:val="es-MX"/>
-              </w:rPr>
-              <w:t>, HTTPS/MQTT TLS, integración pública y TDS de reemplazo.</w:t>
+              <w:t>Empaquetado de producción, VPS rootless, HTTPS/MQTT TLS, integración pública y TDS de reemplazo.</w:t>
             </w:r>
           </w:p>
         </w:tc>
@@ -10867,16 +8910,8 @@
               <w:rPr>
                 <w:sz w:val="18"/>
               </w:rPr>
-              <w:t xml:space="preserve">26 oct–1 </w:t>
-            </w:r>
-            <w:proofErr w:type="spellStart"/>
-            <w:r>
-              <w:rPr>
-                <w:sz w:val="18"/>
-              </w:rPr>
-              <w:t>nov</w:t>
-            </w:r>
-            <w:proofErr w:type="spellEnd"/>
+              <w:t>26 oct–1 nov</w:t>
+            </w:r>
           </w:p>
         </w:tc>
         <w:tc>
@@ -10958,16 +8993,8 @@
               <w:rPr>
                 <w:sz w:val="18"/>
               </w:rPr>
-              <w:t xml:space="preserve">2–8 </w:t>
-            </w:r>
-            <w:proofErr w:type="spellStart"/>
-            <w:r>
-              <w:rPr>
-                <w:sz w:val="18"/>
-              </w:rPr>
-              <w:t>nov</w:t>
-            </w:r>
-            <w:proofErr w:type="spellEnd"/>
+              <w:t>2–8 nov</w:t>
+            </w:r>
           </w:p>
         </w:tc>
         <w:tc>
@@ -11049,16 +9076,8 @@
               <w:rPr>
                 <w:sz w:val="18"/>
               </w:rPr>
-              <w:t xml:space="preserve">9–15 </w:t>
-            </w:r>
-            <w:proofErr w:type="spellStart"/>
-            <w:r>
-              <w:rPr>
-                <w:sz w:val="18"/>
-              </w:rPr>
-              <w:t>nov</w:t>
-            </w:r>
-            <w:proofErr w:type="spellEnd"/>
+              <w:t>9–15 nov</w:t>
+            </w:r>
           </w:p>
         </w:tc>
         <w:tc>
@@ -11140,16 +9159,8 @@
               <w:rPr>
                 <w:sz w:val="18"/>
               </w:rPr>
-              <w:t xml:space="preserve">16–22 </w:t>
-            </w:r>
-            <w:proofErr w:type="spellStart"/>
-            <w:r>
-              <w:rPr>
-                <w:sz w:val="18"/>
-              </w:rPr>
-              <w:t>nov</w:t>
-            </w:r>
-            <w:proofErr w:type="spellEnd"/>
+              <w:t>16–22 nov</w:t>
+            </w:r>
           </w:p>
         </w:tc>
         <w:tc>
@@ -11231,16 +9242,8 @@
               <w:rPr>
                 <w:sz w:val="18"/>
               </w:rPr>
-              <w:t xml:space="preserve">23–29 </w:t>
-            </w:r>
-            <w:proofErr w:type="spellStart"/>
-            <w:r>
-              <w:rPr>
-                <w:sz w:val="18"/>
-              </w:rPr>
-              <w:t>nov</w:t>
-            </w:r>
-            <w:proofErr w:type="spellEnd"/>
+              <w:t>23–29 nov</w:t>
+            </w:r>
           </w:p>
         </w:tc>
         <w:tc>
@@ -11322,30 +9325,8 @@
               <w:rPr>
                 <w:sz w:val="18"/>
               </w:rPr>
-              <w:t xml:space="preserve">30 </w:t>
-            </w:r>
-            <w:proofErr w:type="spellStart"/>
-            <w:r>
-              <w:rPr>
-                <w:sz w:val="18"/>
-              </w:rPr>
-              <w:t>nov</w:t>
-            </w:r>
-            <w:proofErr w:type="spellEnd"/>
-            <w:r>
-              <w:rPr>
-                <w:sz w:val="18"/>
-              </w:rPr>
-              <w:t xml:space="preserve">–2 </w:t>
-            </w:r>
-            <w:proofErr w:type="spellStart"/>
-            <w:r>
-              <w:rPr>
-                <w:sz w:val="18"/>
-              </w:rPr>
-              <w:t>dic</w:t>
-            </w:r>
-            <w:proofErr w:type="spellEnd"/>
+              <w:t>30 nov–2 dic</w:t>
+            </w:r>
           </w:p>
         </w:tc>
         <w:tc>
@@ -11439,7 +9420,6 @@
           <w:sz w:val="29"/>
           <w:lang w:val="es-MX"/>
         </w:rPr>
-        <w:lastRenderedPageBreak/>
         <w:t>11. Presupuesto actualizado</w:t>
       </w:r>
     </w:p>
@@ -11454,7 +9434,19 @@
         <w:rPr>
           <w:lang w:val="es-MX"/>
         </w:rPr>
-        <w:t>Importes en MXN. El presupuesto se actualiza con las compras y el precio pagado confirmados por el responsable el 21 de octubre de 2026.</w:t>
+        <w:t xml:space="preserve">Importes en MXN. El presupuesto se actualiza con las compras y el </w:t>
+      </w:r>
+      <w:r>
+        <w:rPr>
+          <w:lang w:val="es-MX"/>
+        </w:rPr>
+        <w:t>precio pagado registrados el 21 de octubre</w:t>
+      </w:r>
+      <w:r>
+        <w:rPr>
+          <w:lang w:val="es-MX"/>
+        </w:rPr>
+        <w:t xml:space="preserve"> de 2026.</w:t>
       </w:r>
     </w:p>
     <w:p>
@@ -11462,47 +9454,13 @@
         <w:keepNext/>
         <w:spacing w:before="80" w:after="100" w:line="252" w:lineRule="auto"/>
       </w:pPr>
-      <w:proofErr w:type="spellStart"/>
       <w:r>
         <w:rPr>
           <w:b/>
           <w:sz w:val="24"/>
         </w:rPr>
-        <w:t>Componentes</w:t>
+        <w:t>Componentes del lote electrónico</w:t>
       </w:r>
-      <w:proofErr w:type="spellEnd"/>
-      <w:r>
-        <w:rPr>
-          <w:b/>
-          <w:sz w:val="24"/>
-        </w:rPr>
-        <w:t xml:space="preserve"> del </w:t>
-      </w:r>
-      <w:proofErr w:type="spellStart"/>
-      <w:r>
-        <w:rPr>
-          <w:b/>
-          <w:sz w:val="24"/>
-        </w:rPr>
-        <w:t>lote</w:t>
-      </w:r>
-      <w:proofErr w:type="spellEnd"/>
-      <w:r>
-        <w:rPr>
-          <w:b/>
-          <w:sz w:val="24"/>
-        </w:rPr>
-        <w:t xml:space="preserve"> </w:t>
-      </w:r>
-      <w:proofErr w:type="spellStart"/>
-      <w:r>
-        <w:rPr>
-          <w:b/>
-          <w:sz w:val="24"/>
-        </w:rPr>
-        <w:t>electrónico</w:t>
-      </w:r>
-      <w:proofErr w:type="spellEnd"/>
     </w:p>
     <w:tbl>
       <w:tblPr>
@@ -12173,31 +10131,13 @@
         <w:keepNext/>
         <w:spacing w:before="80" w:after="100" w:line="252" w:lineRule="auto"/>
       </w:pPr>
-      <w:proofErr w:type="spellStart"/>
       <w:r>
         <w:rPr>
           <w:b/>
           <w:sz w:val="24"/>
         </w:rPr>
-        <w:t>Resumen</w:t>
+        <w:t>Resumen del presupuesto</w:t>
       </w:r>
-      <w:proofErr w:type="spellEnd"/>
-      <w:r>
-        <w:rPr>
-          <w:b/>
-          <w:sz w:val="24"/>
-        </w:rPr>
-        <w:t xml:space="preserve"> del </w:t>
-      </w:r>
-      <w:proofErr w:type="spellStart"/>
-      <w:r>
-        <w:rPr>
-          <w:b/>
-          <w:sz w:val="24"/>
-        </w:rPr>
-        <w:t>presupuesto</w:t>
-      </w:r>
-      <w:proofErr w:type="spellEnd"/>
     </w:p>
     <w:tbl>
       <w:tblPr>
@@ -12528,7 +10468,21 @@
           <w:sz w:val="17"/>
           <w:lang w:val="es-MX"/>
         </w:rPr>
-        <w:t>Fuente: relación de componentes, precios pagados y presupuesto máximo proporcionados por el responsable el 21 de octubre de 2026. No se presentan como comprobantes fiscales verificados.</w:t>
+        <w:t xml:space="preserve">Fuente: relación de componentes, precios pagados y </w:t>
+      </w:r>
+      <w:r>
+        <w:rPr>
+          <w:sz w:val="17"/>
+          <w:lang w:val="es-MX"/>
+        </w:rPr>
+        <w:t>presupuesto máximo registrados el 21 de octubre</w:t>
+      </w:r>
+      <w:r>
+        <w:rPr>
+          <w:sz w:val="17"/>
+          <w:lang w:val="es-MX"/>
+        </w:rPr>
+        <w:t xml:space="preserve"> de 2026. No se presentan como comprobantes fiscales verificados.</w:t>
       </w:r>
     </w:p>
     <w:p>
@@ -12546,7 +10500,6 @@
           <w:sz w:val="29"/>
           <w:lang w:val="es-MX"/>
         </w:rPr>
-        <w:lastRenderedPageBreak/>
         <w:t>12. Riesgos y acciones previstas</w:t>
       </w:r>
     </w:p>
@@ -12720,21 +10673,12 @@
                 <w:lang w:val="es-MX"/>
               </w:rPr>
             </w:pPr>
-            <w:proofErr w:type="spellStart"/>
-            <w:r>
-              <w:rPr>
-                <w:sz w:val="18"/>
-                <w:lang w:val="es-MX"/>
-              </w:rPr>
-              <w:t>Wi</w:t>
-            </w:r>
-            <w:proofErr w:type="spellEnd"/>
-            <w:r>
-              <w:rPr>
-                <w:sz w:val="18"/>
-                <w:lang w:val="es-MX"/>
-              </w:rPr>
-              <w:t>-Fi o Internet no disponible</w:t>
+            <w:r>
+              <w:rPr>
+                <w:sz w:val="18"/>
+                <w:lang w:val="es-MX"/>
+              </w:rPr>
+              <w:t>Wi-Fi o Internet no disponible</w:t>
             </w:r>
           </w:p>
         </w:tc>
@@ -12757,49 +10701,7 @@
               <w:rPr>
                 <w:sz w:val="18"/>
               </w:rPr>
-              <w:t xml:space="preserve">No </w:t>
-            </w:r>
-            <w:proofErr w:type="spellStart"/>
-            <w:r>
-              <w:rPr>
-                <w:sz w:val="18"/>
-              </w:rPr>
-              <w:t>llegan</w:t>
-            </w:r>
-            <w:proofErr w:type="spellEnd"/>
-            <w:r>
-              <w:rPr>
-                <w:sz w:val="18"/>
-              </w:rPr>
-              <w:t xml:space="preserve"> </w:t>
-            </w:r>
-            <w:proofErr w:type="spellStart"/>
-            <w:r>
-              <w:rPr>
-                <w:sz w:val="18"/>
-              </w:rPr>
-              <w:t>nuevas</w:t>
-            </w:r>
-            <w:proofErr w:type="spellEnd"/>
-            <w:r>
-              <w:rPr>
-                <w:sz w:val="18"/>
-              </w:rPr>
-              <w:t xml:space="preserve"> </w:t>
-            </w:r>
-            <w:proofErr w:type="spellStart"/>
-            <w:r>
-              <w:rPr>
-                <w:sz w:val="18"/>
-              </w:rPr>
-              <w:t>lecturas</w:t>
-            </w:r>
-            <w:proofErr w:type="spellEnd"/>
-            <w:r>
-              <w:rPr>
-                <w:sz w:val="18"/>
-              </w:rPr>
-              <w:t>.</w:t>
+              <w:t>No llegan nuevas lecturas.</w:t>
             </w:r>
           </w:p>
         </w:tc>
@@ -12967,39 +10869,14 @@
                 <w:sz w:val="18"/>
                 <w:lang w:val="es-MX"/>
               </w:rPr>
-              <w:t xml:space="preserve">Enviar </w:t>
-            </w:r>
-            <w:proofErr w:type="spellStart"/>
-            <w:r>
-              <w:rPr>
-                <w:sz w:val="18"/>
-                <w:lang w:val="es-MX"/>
-              </w:rPr>
-              <w:t>null</w:t>
-            </w:r>
-            <w:proofErr w:type="spellEnd"/>
-            <w:r>
-              <w:rPr>
-                <w:sz w:val="18"/>
-                <w:lang w:val="es-MX"/>
-              </w:rPr>
-              <w:t>/</w:t>
-            </w:r>
-            <w:proofErr w:type="spellStart"/>
-            <w:r>
-              <w:rPr>
-                <w:sz w:val="18"/>
-                <w:lang w:val="es-MX"/>
-              </w:rPr>
-              <w:t>invalid</w:t>
-            </w:r>
-            <w:proofErr w:type="spellEnd"/>
-            <w:r>
-              <w:rPr>
-                <w:sz w:val="18"/>
-                <w:lang w:val="es-MX"/>
-              </w:rPr>
-              <w:t xml:space="preserve"> y reparar; no inventar valores.</w:t>
+              <w:t xml:space="preserve">Enviar null/invalid y </w:t>
+            </w:r>
+            <w:r>
+              <w:rPr>
+                <w:sz w:val="18"/>
+                <w:lang w:val="es-MX"/>
+              </w:rPr>
+              <w:t>reparar; sin valores de relleno.</w:t>
             </w:r>
           </w:p>
         </w:tc>
@@ -13024,42 +10901,12 @@
             <w:pPr>
               <w:spacing w:before="40" w:after="60" w:line="252" w:lineRule="auto"/>
             </w:pPr>
-            <w:proofErr w:type="spellStart"/>
-            <w:r>
-              <w:rPr>
-                <w:sz w:val="18"/>
-              </w:rPr>
-              <w:t>Reinicio</w:t>
-            </w:r>
-            <w:proofErr w:type="spellEnd"/>
-            <w:r>
-              <w:rPr>
-                <w:sz w:val="18"/>
-              </w:rPr>
-              <w:t xml:space="preserve"> o </w:t>
-            </w:r>
-            <w:proofErr w:type="spellStart"/>
-            <w:r>
-              <w:rPr>
-                <w:sz w:val="18"/>
-              </w:rPr>
-              <w:t>mensaje</w:t>
-            </w:r>
-            <w:proofErr w:type="spellEnd"/>
-            <w:r>
-              <w:rPr>
-                <w:sz w:val="18"/>
-              </w:rPr>
-              <w:t xml:space="preserve"> </w:t>
-            </w:r>
-            <w:proofErr w:type="spellStart"/>
-            <w:r>
-              <w:rPr>
-                <w:sz w:val="18"/>
-              </w:rPr>
-              <w:t>repetido</w:t>
-            </w:r>
-            <w:proofErr w:type="spellEnd"/>
+            <w:r>
+              <w:rPr>
+                <w:sz w:val="18"/>
+              </w:rPr>
+              <w:t>Reinicio o mensaje repetido</w:t>
+            </w:r>
           </w:p>
         </w:tc>
         <w:tc>
@@ -13191,33 +11038,11 @@
             <w:pPr>
               <w:spacing w:before="40" w:after="60" w:line="252" w:lineRule="auto"/>
             </w:pPr>
-            <w:proofErr w:type="spellStart"/>
-            <w:r>
-              <w:rPr>
-                <w:sz w:val="18"/>
-              </w:rPr>
-              <w:t>Interrupción</w:t>
-            </w:r>
-            <w:proofErr w:type="spellEnd"/>
-            <w:r>
-              <w:rPr>
-                <w:sz w:val="18"/>
-              </w:rPr>
-              <w:t xml:space="preserve"> o </w:t>
-            </w:r>
-            <w:proofErr w:type="spellStart"/>
-            <w:r>
-              <w:rPr>
-                <w:sz w:val="18"/>
-              </w:rPr>
-              <w:t>acceso</w:t>
-            </w:r>
-            <w:proofErr w:type="spellEnd"/>
-            <w:r>
-              <w:rPr>
-                <w:sz w:val="18"/>
-              </w:rPr>
-              <w:t xml:space="preserve"> cruzado.</w:t>
+            <w:r>
+              <w:rPr>
+                <w:sz w:val="18"/>
+              </w:rPr>
+              <w:t>Interrupción o acceso cruzado.</w:t>
             </w:r>
           </w:p>
         </w:tc>
@@ -13239,7 +11064,6 @@
                 <w:lang w:val="es-MX"/>
               </w:rPr>
             </w:pPr>
-            <w:proofErr w:type="spellStart"/>
             <w:r>
               <w:rPr>
                 <w:sz w:val="18"/>
@@ -13247,7 +11071,6 @@
               </w:rPr>
               <w:t>Rootless</w:t>
             </w:r>
-            <w:proofErr w:type="spellEnd"/>
             <w:r>
               <w:rPr>
                 <w:sz w:val="18"/>
@@ -13280,23 +11103,7 @@
                 <w:sz w:val="18"/>
                 <w:lang w:val="es-MX"/>
               </w:rPr>
-              <w:t xml:space="preserve">Intervenir solo </w:t>
-            </w:r>
-            <w:proofErr w:type="spellStart"/>
-            <w:r>
-              <w:rPr>
-                <w:sz w:val="18"/>
-                <w:lang w:val="es-MX"/>
-              </w:rPr>
-              <w:t>HydroMate</w:t>
-            </w:r>
-            <w:proofErr w:type="spellEnd"/>
-            <w:r>
-              <w:rPr>
-                <w:sz w:val="18"/>
-                <w:lang w:val="es-MX"/>
-              </w:rPr>
-              <w:t xml:space="preserve"> y recuperar su respaldo.</w:t>
+              <w:t>Intervenir solo HydroMate y recuperar su respaldo.</w:t>
             </w:r>
           </w:p>
         </w:tc>
@@ -13321,28 +11128,12 @@
             <w:pPr>
               <w:spacing w:before="40" w:after="60" w:line="252" w:lineRule="auto"/>
             </w:pPr>
-            <w:proofErr w:type="spellStart"/>
-            <w:r>
-              <w:rPr>
-                <w:sz w:val="18"/>
-              </w:rPr>
-              <w:t>Exposición</w:t>
-            </w:r>
-            <w:proofErr w:type="spellEnd"/>
-            <w:r>
-              <w:rPr>
-                <w:sz w:val="18"/>
-              </w:rPr>
-              <w:t xml:space="preserve"> de </w:t>
-            </w:r>
-            <w:proofErr w:type="spellStart"/>
-            <w:r>
-              <w:rPr>
-                <w:sz w:val="18"/>
-              </w:rPr>
-              <w:t>credenciales</w:t>
-            </w:r>
-            <w:proofErr w:type="spellEnd"/>
+            <w:r>
+              <w:rPr>
+                <w:sz w:val="18"/>
+              </w:rPr>
+              <w:t>Exposición de credenciales</w:t>
+            </w:r>
           </w:p>
         </w:tc>
         <w:tc>
@@ -13447,44 +11238,8 @@
               <w:rPr>
                 <w:sz w:val="18"/>
               </w:rPr>
-              <w:t xml:space="preserve">Lectura </w:t>
-            </w:r>
-            <w:proofErr w:type="spellStart"/>
-            <w:r>
-              <w:rPr>
-                <w:sz w:val="18"/>
-              </w:rPr>
-              <w:t>antigua</w:t>
-            </w:r>
-            <w:proofErr w:type="spellEnd"/>
-            <w:r>
-              <w:rPr>
-                <w:sz w:val="18"/>
-              </w:rPr>
-              <w:t xml:space="preserve"> </w:t>
-            </w:r>
-            <w:proofErr w:type="spellStart"/>
-            <w:r>
-              <w:rPr>
-                <w:sz w:val="18"/>
-              </w:rPr>
-              <w:t>entregada</w:t>
-            </w:r>
-            <w:proofErr w:type="spellEnd"/>
-            <w:r>
-              <w:rPr>
-                <w:sz w:val="18"/>
-              </w:rPr>
-              <w:t xml:space="preserve"> </w:t>
-            </w:r>
-            <w:proofErr w:type="spellStart"/>
-            <w:r>
-              <w:rPr>
-                <w:sz w:val="18"/>
-              </w:rPr>
-              <w:t>tarde</w:t>
-            </w:r>
-            <w:proofErr w:type="spellEnd"/>
+              <w:t>Lectura antigua entregada tarde</w:t>
+            </w:r>
           </w:p>
         </w:tc>
         <w:tc>
@@ -13510,23 +11265,7 @@
                 <w:sz w:val="18"/>
                 <w:lang w:val="es-MX"/>
               </w:rPr>
-              <w:t xml:space="preserve">La </w:t>
-            </w:r>
-            <w:proofErr w:type="gramStart"/>
-            <w:r>
-              <w:rPr>
-                <w:sz w:val="18"/>
-                <w:lang w:val="es-MX"/>
-              </w:rPr>
-              <w:t>app</w:t>
-            </w:r>
-            <w:proofErr w:type="gramEnd"/>
-            <w:r>
-              <w:rPr>
-                <w:sz w:val="18"/>
-                <w:lang w:val="es-MX"/>
-              </w:rPr>
-              <w:t xml:space="preserve"> parece reciente sin serlo.</w:t>
+              <w:t>La app parece reciente sin serlo.</w:t>
             </w:r>
           </w:p>
         </w:tc>
@@ -13605,42 +11344,12 @@
             <w:pPr>
               <w:spacing w:before="40" w:after="60" w:line="252" w:lineRule="auto"/>
             </w:pPr>
-            <w:proofErr w:type="spellStart"/>
-            <w:r>
-              <w:rPr>
-                <w:sz w:val="18"/>
-              </w:rPr>
-              <w:t>Actuador</w:t>
-            </w:r>
-            <w:proofErr w:type="spellEnd"/>
-            <w:r>
-              <w:rPr>
-                <w:sz w:val="18"/>
-              </w:rPr>
-              <w:t xml:space="preserve"> </w:t>
-            </w:r>
-            <w:proofErr w:type="spellStart"/>
-            <w:r>
-              <w:rPr>
-                <w:sz w:val="18"/>
-              </w:rPr>
-              <w:t>conectado</w:t>
-            </w:r>
-            <w:proofErr w:type="spellEnd"/>
-            <w:r>
-              <w:rPr>
-                <w:sz w:val="18"/>
-              </w:rPr>
-              <w:t xml:space="preserve"> sin </w:t>
-            </w:r>
-            <w:proofErr w:type="spellStart"/>
-            <w:r>
-              <w:rPr>
-                <w:sz w:val="18"/>
-              </w:rPr>
-              <w:t>protecciones</w:t>
-            </w:r>
-            <w:proofErr w:type="spellEnd"/>
+            <w:r>
+              <w:rPr>
+                <w:sz w:val="18"/>
+              </w:rPr>
+              <w:t>Actuador conectado sin protecciones</w:t>
+            </w:r>
           </w:p>
         </w:tc>
         <w:tc>
@@ -13715,21 +11424,12 @@
                 <w:lang w:val="es-MX"/>
               </w:rPr>
             </w:pPr>
-            <w:proofErr w:type="spellStart"/>
-            <w:r>
-              <w:rPr>
-                <w:sz w:val="18"/>
-                <w:lang w:val="es-MX"/>
-              </w:rPr>
-              <w:t>Desenergizar</w:t>
-            </w:r>
-            <w:proofErr w:type="spellEnd"/>
-            <w:r>
-              <w:rPr>
-                <w:sz w:val="18"/>
-                <w:lang w:val="es-MX"/>
-              </w:rPr>
-              <w:t xml:space="preserve"> y probar con agua en banco.</w:t>
+            <w:r>
+              <w:rPr>
+                <w:sz w:val="18"/>
+                <w:lang w:val="es-MX"/>
+              </w:rPr>
+              <w:t>Desenergizar y probar con agua en banco.</w:t>
             </w:r>
           </w:p>
         </w:tc>
@@ -13781,47 +11481,11 @@
             <w:pPr>
               <w:spacing w:before="40" w:after="60" w:line="252" w:lineRule="auto"/>
             </w:pPr>
-            <w:proofErr w:type="spellStart"/>
-            <w:r>
-              <w:rPr>
-                <w:sz w:val="18"/>
-              </w:rPr>
-              <w:t>Retraso</w:t>
-            </w:r>
-            <w:proofErr w:type="spellEnd"/>
-            <w:r>
-              <w:rPr>
-                <w:sz w:val="18"/>
-              </w:rPr>
-              <w:t xml:space="preserve"> o </w:t>
-            </w:r>
-            <w:proofErr w:type="spellStart"/>
-            <w:r>
-              <w:rPr>
-                <w:sz w:val="18"/>
-              </w:rPr>
-              <w:t>compra</w:t>
-            </w:r>
-            <w:proofErr w:type="spellEnd"/>
-            <w:r>
-              <w:rPr>
-                <w:sz w:val="18"/>
-              </w:rPr>
-              <w:t xml:space="preserve"> </w:t>
-            </w:r>
-            <w:proofErr w:type="spellStart"/>
-            <w:r>
-              <w:rPr>
-                <w:sz w:val="18"/>
-              </w:rPr>
-              <w:t>duplicada</w:t>
-            </w:r>
-            <w:proofErr w:type="spellEnd"/>
-            <w:r>
-              <w:rPr>
-                <w:sz w:val="18"/>
-              </w:rPr>
-              <w:t>.</w:t>
+            <w:r>
+              <w:rPr>
+                <w:sz w:val="18"/>
+              </w:rPr>
+              <w:t>Retraso o compra duplicada.</w:t>
             </w:r>
           </w:p>
         </w:tc>
@@ -13930,7 +11594,6 @@
           <w:sz w:val="29"/>
           <w:lang w:val="es-MX"/>
         </w:rPr>
-        <w:lastRenderedPageBreak/>
         <w:t>13. Revisión de requisitos técnicos</w:t>
       </w:r>
     </w:p>
@@ -13945,31 +11608,7 @@
         <w:t xml:space="preserve">C significa comprobado con ejecución o evidencia física. V significa verificado en código o en un ensayo local de software; el alcance se identifica en la evidencia. </w:t>
       </w:r>
       <w:r>
-        <w:t xml:space="preserve">La </w:t>
-      </w:r>
-      <w:proofErr w:type="spellStart"/>
-      <w:r>
-        <w:t>aprobación</w:t>
-      </w:r>
-      <w:proofErr w:type="spellEnd"/>
-      <w:r>
-        <w:t xml:space="preserve"> de </w:t>
-      </w:r>
-      <w:proofErr w:type="spellStart"/>
-      <w:r>
-        <w:t>viabilidad</w:t>
-      </w:r>
-      <w:proofErr w:type="spellEnd"/>
-      <w:r>
-        <w:t xml:space="preserve"> </w:t>
-      </w:r>
-      <w:proofErr w:type="spellStart"/>
-      <w:r>
-        <w:t>corresponde</w:t>
-      </w:r>
-      <w:proofErr w:type="spellEnd"/>
-      <w:r>
-        <w:t xml:space="preserve"> al docente.</w:t>
+        <w:t>La aprobación de viabilidad corresponde al docente.</w:t>
       </w:r>
     </w:p>
     <w:tbl>
@@ -14264,28 +11903,12 @@
             <w:pPr>
               <w:spacing w:before="40" w:after="60" w:line="252" w:lineRule="auto"/>
             </w:pPr>
-            <w:proofErr w:type="spellStart"/>
-            <w:r>
-              <w:rPr>
-                <w:sz w:val="18"/>
-              </w:rPr>
-              <w:t>Procesamiento</w:t>
-            </w:r>
-            <w:proofErr w:type="spellEnd"/>
-            <w:r>
-              <w:rPr>
-                <w:sz w:val="18"/>
-              </w:rPr>
-              <w:t xml:space="preserve"> </w:t>
-            </w:r>
-            <w:proofErr w:type="spellStart"/>
-            <w:r>
-              <w:rPr>
-                <w:sz w:val="18"/>
-              </w:rPr>
-              <w:t>básico</w:t>
-            </w:r>
-            <w:proofErr w:type="spellEnd"/>
+            <w:r>
+              <w:rPr>
+                <w:sz w:val="18"/>
+              </w:rPr>
+              <w:t>Procesamiento básico</w:t>
+            </w:r>
           </w:p>
         </w:tc>
         <w:tc>
@@ -14359,14 +11982,12 @@
             <w:pPr>
               <w:spacing w:before="40" w:after="60" w:line="252" w:lineRule="auto"/>
             </w:pPr>
-            <w:proofErr w:type="spellStart"/>
             <w:r>
               <w:rPr>
                 <w:sz w:val="18"/>
               </w:rPr>
               <w:t>Conectarse</w:t>
             </w:r>
-            <w:proofErr w:type="spellEnd"/>
             <w:r>
               <w:rPr>
                 <w:sz w:val="18"/>
@@ -14421,23 +12042,7 @@
                 <w:sz w:val="18"/>
                 <w:lang w:val="es-MX"/>
               </w:rPr>
-              <w:t xml:space="preserve">ESP32 conectado por </w:t>
-            </w:r>
-            <w:proofErr w:type="spellStart"/>
-            <w:r>
-              <w:rPr>
-                <w:sz w:val="18"/>
-                <w:lang w:val="es-MX"/>
-              </w:rPr>
-              <w:t>Wi</w:t>
-            </w:r>
-            <w:proofErr w:type="spellEnd"/>
-            <w:r>
-              <w:rPr>
-                <w:sz w:val="18"/>
-                <w:lang w:val="es-MX"/>
-              </w:rPr>
-              <w:t>-Fi y MQTT TLS público.</w:t>
+              <w:t>ESP32 conectado por Wi-Fi y MQTT TLS público.</w:t>
             </w:r>
           </w:p>
         </w:tc>
@@ -14470,17 +12075,8 @@
                 <w:sz w:val="18"/>
                 <w:lang w:val="es-MX"/>
               </w:rPr>
-              <w:t xml:space="preserve">Enviar un tipo de dato al </w:t>
-            </w:r>
-            <w:proofErr w:type="spellStart"/>
-            <w:r>
-              <w:rPr>
-                <w:sz w:val="18"/>
-                <w:lang w:val="es-MX"/>
-              </w:rPr>
-              <w:t>backend</w:t>
-            </w:r>
-            <w:proofErr w:type="spellEnd"/>
+              <w:t>Enviar un tipo de dato al backend</w:t>
+            </w:r>
           </w:p>
         </w:tc>
         <w:tc>
@@ -14554,28 +12150,12 @@
             <w:pPr>
               <w:spacing w:before="40" w:after="60" w:line="252" w:lineRule="auto"/>
             </w:pPr>
-            <w:proofErr w:type="spellStart"/>
-            <w:r>
-              <w:rPr>
-                <w:sz w:val="18"/>
-              </w:rPr>
-              <w:t>Identificar</w:t>
-            </w:r>
-            <w:proofErr w:type="spellEnd"/>
-            <w:r>
-              <w:rPr>
-                <w:sz w:val="18"/>
-              </w:rPr>
-              <w:t xml:space="preserve"> </w:t>
-            </w:r>
-            <w:proofErr w:type="spellStart"/>
-            <w:r>
-              <w:rPr>
-                <w:sz w:val="18"/>
-              </w:rPr>
-              <w:t>medición</w:t>
-            </w:r>
-            <w:proofErr w:type="spellEnd"/>
+            <w:r>
+              <w:rPr>
+                <w:sz w:val="18"/>
+              </w:rPr>
+              <w:t>Identificar medición</w:t>
+            </w:r>
           </w:p>
         </w:tc>
         <w:tc>
@@ -14724,42 +12304,12 @@
             <w:pPr>
               <w:spacing w:before="40" w:after="60" w:line="252" w:lineRule="auto"/>
             </w:pPr>
-            <w:proofErr w:type="spellStart"/>
-            <w:r>
-              <w:rPr>
-                <w:sz w:val="18"/>
-              </w:rPr>
-              <w:t>Recibir</w:t>
-            </w:r>
-            <w:proofErr w:type="spellEnd"/>
-            <w:r>
-              <w:rPr>
-                <w:sz w:val="18"/>
-              </w:rPr>
-              <w:t xml:space="preserve"> </w:t>
-            </w:r>
-            <w:proofErr w:type="spellStart"/>
-            <w:r>
-              <w:rPr>
-                <w:sz w:val="18"/>
-              </w:rPr>
-              <w:t>dato</w:t>
-            </w:r>
-            <w:proofErr w:type="spellEnd"/>
-            <w:r>
-              <w:rPr>
-                <w:sz w:val="18"/>
-              </w:rPr>
-              <w:t xml:space="preserve"> del </w:t>
-            </w:r>
-            <w:proofErr w:type="spellStart"/>
-            <w:r>
-              <w:rPr>
-                <w:sz w:val="18"/>
-              </w:rPr>
-              <w:t>embebido</w:t>
-            </w:r>
-            <w:proofErr w:type="spellEnd"/>
+            <w:r>
+              <w:rPr>
+                <w:sz w:val="18"/>
+              </w:rPr>
+              <w:t>Recibir dato del embebido</w:t>
+            </w:r>
           </w:p>
         </w:tc>
         <w:tc>
@@ -15074,30 +12624,8 @@
               <w:rPr>
                 <w:sz w:val="18"/>
               </w:rPr>
-              <w:t xml:space="preserve">Respuesta </w:t>
-            </w:r>
-            <w:proofErr w:type="spellStart"/>
-            <w:r>
-              <w:rPr>
-                <w:sz w:val="18"/>
-              </w:rPr>
-              <w:t>válida</w:t>
-            </w:r>
-            <w:proofErr w:type="spellEnd"/>
-            <w:r>
-              <w:rPr>
-                <w:sz w:val="18"/>
-              </w:rPr>
-              <w:t xml:space="preserve"> e </w:t>
-            </w:r>
-            <w:proofErr w:type="spellStart"/>
-            <w:r>
-              <w:rPr>
-                <w:sz w:val="18"/>
-              </w:rPr>
-              <w:t>incorrecta</w:t>
-            </w:r>
-            <w:proofErr w:type="spellEnd"/>
+              <w:t>Respuesta válida e incorrecta</w:t>
+            </w:r>
           </w:p>
         </w:tc>
         <w:tc>
@@ -15146,23 +12674,7 @@
                 <w:sz w:val="18"/>
                 <w:lang w:val="es-MX"/>
               </w:rPr>
-              <w:t xml:space="preserve">Prueba HTTP y MQTT local con </w:t>
-            </w:r>
-            <w:proofErr w:type="spellStart"/>
-            <w:r>
-              <w:rPr>
-                <w:sz w:val="18"/>
-                <w:lang w:val="es-MX"/>
-              </w:rPr>
-              <w:t>ph</w:t>
-            </w:r>
-            <w:proofErr w:type="spellEnd"/>
-            <w:r>
-              <w:rPr>
-                <w:sz w:val="18"/>
-                <w:lang w:val="es-MX"/>
-              </w:rPr>
-              <w:t>=50, HTTP 422.</w:t>
+              <w:t>Prueba HTTP y MQTT local con ph=50, HTTP 422.</w:t>
             </w:r>
           </w:p>
         </w:tc>
@@ -15191,30 +12703,8 @@
               <w:rPr>
                 <w:sz w:val="18"/>
               </w:rPr>
-              <w:t xml:space="preserve">Una </w:t>
-            </w:r>
-            <w:proofErr w:type="spellStart"/>
-            <w:r>
-              <w:rPr>
-                <w:sz w:val="18"/>
-              </w:rPr>
-              <w:t>tabla</w:t>
-            </w:r>
-            <w:proofErr w:type="spellEnd"/>
-            <w:r>
-              <w:rPr>
-                <w:sz w:val="18"/>
-              </w:rPr>
-              <w:t xml:space="preserve"> o </w:t>
-            </w:r>
-            <w:proofErr w:type="spellStart"/>
-            <w:r>
-              <w:rPr>
-                <w:sz w:val="18"/>
-              </w:rPr>
-              <w:t>colección</w:t>
-            </w:r>
-            <w:proofErr w:type="spellEnd"/>
+              <w:t>Una tabla o colección</w:t>
+            </w:r>
           </w:p>
         </w:tc>
         <w:tc>
@@ -15338,39 +12828,7 @@
                 <w:sz w:val="18"/>
                 <w:lang w:val="es-MX"/>
               </w:rPr>
-              <w:t xml:space="preserve">id y clave única </w:t>
-            </w:r>
-            <w:proofErr w:type="spellStart"/>
-            <w:r>
-              <w:rPr>
-                <w:sz w:val="18"/>
-                <w:lang w:val="es-MX"/>
-              </w:rPr>
-              <w:t>device_id</w:t>
-            </w:r>
-            <w:proofErr w:type="spellEnd"/>
-            <w:r>
-              <w:rPr>
-                <w:sz w:val="18"/>
-                <w:lang w:val="es-MX"/>
-              </w:rPr>
-              <w:t>/</w:t>
-            </w:r>
-            <w:proofErr w:type="spellStart"/>
-            <w:r>
-              <w:rPr>
-                <w:sz w:val="18"/>
-                <w:lang w:val="es-MX"/>
-              </w:rPr>
-              <w:t>sequence</w:t>
-            </w:r>
-            <w:proofErr w:type="spellEnd"/>
-            <w:r>
-              <w:rPr>
-                <w:sz w:val="18"/>
-                <w:lang w:val="es-MX"/>
-              </w:rPr>
-              <w:t>.</w:t>
+              <w:t>id y clave única device_id/sequence.</w:t>
             </w:r>
           </w:p>
         </w:tc>
@@ -15478,30 +12936,8 @@
               <w:rPr>
                 <w:sz w:val="18"/>
               </w:rPr>
-              <w:t xml:space="preserve">Unidad </w:t>
-            </w:r>
-            <w:proofErr w:type="spellStart"/>
-            <w:r>
-              <w:rPr>
-                <w:sz w:val="18"/>
-              </w:rPr>
-              <w:t>cuando</w:t>
-            </w:r>
-            <w:proofErr w:type="spellEnd"/>
-            <w:r>
-              <w:rPr>
-                <w:sz w:val="18"/>
-              </w:rPr>
-              <w:t xml:space="preserve"> </w:t>
-            </w:r>
-            <w:proofErr w:type="spellStart"/>
-            <w:r>
-              <w:rPr>
-                <w:sz w:val="18"/>
-              </w:rPr>
-              <w:t>corresponda</w:t>
-            </w:r>
-            <w:proofErr w:type="spellEnd"/>
+              <w:t>Unidad cuando corresponda</w:t>
+            </w:r>
           </w:p>
         </w:tc>
         <w:tc>
@@ -15575,19 +13011,11 @@
             <w:pPr>
               <w:spacing w:before="40" w:after="60" w:line="252" w:lineRule="auto"/>
             </w:pPr>
-            <w:proofErr w:type="spellStart"/>
-            <w:r>
-              <w:rPr>
-                <w:sz w:val="18"/>
-              </w:rPr>
-              <w:t>Fecha</w:t>
-            </w:r>
-            <w:proofErr w:type="spellEnd"/>
-            <w:r>
-              <w:rPr>
-                <w:sz w:val="18"/>
-              </w:rPr>
-              <w:t xml:space="preserve"> y hora</w:t>
+            <w:r>
+              <w:rPr>
+                <w:sz w:val="18"/>
+              </w:rPr>
+              <w:t>Fecha y hora</w:t>
             </w:r>
           </w:p>
         </w:tc>
@@ -15662,47 +13090,17 @@
             <w:pPr>
               <w:spacing w:before="40" w:after="60" w:line="252" w:lineRule="auto"/>
             </w:pPr>
-            <w:proofErr w:type="spellStart"/>
-            <w:r>
-              <w:rPr>
-                <w:sz w:val="18"/>
-              </w:rPr>
-              <w:t>Mínimo</w:t>
-            </w:r>
-            <w:proofErr w:type="spellEnd"/>
-            <w:r>
-              <w:rPr>
-                <w:sz w:val="18"/>
-              </w:rPr>
-              <w:t xml:space="preserve"> </w:t>
-            </w:r>
-            <w:proofErr w:type="spellStart"/>
-            <w:r>
-              <w:rPr>
-                <w:sz w:val="18"/>
-              </w:rPr>
-              <w:t>diez</w:t>
-            </w:r>
-            <w:proofErr w:type="spellEnd"/>
-            <w:r>
-              <w:rPr>
-                <w:sz w:val="18"/>
-              </w:rPr>
-              <w:t xml:space="preserve"> </w:t>
-            </w:r>
-            <w:proofErr w:type="spellStart"/>
-            <w:r>
-              <w:rPr>
-                <w:sz w:val="18"/>
-              </w:rPr>
-              <w:t>registros</w:t>
-            </w:r>
-            <w:proofErr w:type="spellEnd"/>
-            <w:r>
-              <w:rPr>
-                <w:sz w:val="18"/>
-              </w:rPr>
-              <w:t xml:space="preserve"> reales</w:t>
+            <w:r>
+              <w:rPr>
+                <w:sz w:val="18"/>
+              </w:rPr>
+              <w:t xml:space="preserve">Mínimo diez </w:t>
+            </w:r>
+            <w:r>
+              <w:rPr>
+                <w:sz w:val="18"/>
+              </w:rPr>
+              <w:t>registros reales</w:t>
             </w:r>
           </w:p>
         </w:tc>
@@ -15781,16 +13179,8 @@
               <w:rPr>
                 <w:sz w:val="18"/>
               </w:rPr>
-              <w:t xml:space="preserve">Consulta de </w:t>
-            </w:r>
-            <w:proofErr w:type="spellStart"/>
-            <w:r>
-              <w:rPr>
-                <w:sz w:val="18"/>
-              </w:rPr>
-              <w:t>recuperación</w:t>
-            </w:r>
-            <w:proofErr w:type="spellEnd"/>
+              <w:t>Consulta de recuperación</w:t>
+            </w:r>
           </w:p>
         </w:tc>
         <w:tc>
@@ -15864,28 +13254,12 @@
             <w:pPr>
               <w:spacing w:before="40" w:after="60" w:line="252" w:lineRule="auto"/>
             </w:pPr>
-            <w:proofErr w:type="spellStart"/>
-            <w:r>
-              <w:rPr>
-                <w:sz w:val="18"/>
-              </w:rPr>
-              <w:t>Pantalla</w:t>
-            </w:r>
-            <w:proofErr w:type="spellEnd"/>
-            <w:r>
-              <w:rPr>
-                <w:sz w:val="18"/>
-              </w:rPr>
-              <w:t xml:space="preserve"> </w:t>
-            </w:r>
-            <w:proofErr w:type="spellStart"/>
-            <w:r>
-              <w:rPr>
-                <w:sz w:val="18"/>
-              </w:rPr>
-              <w:t>funcional</w:t>
-            </w:r>
-            <w:proofErr w:type="spellEnd"/>
+            <w:r>
+              <w:rPr>
+                <w:sz w:val="18"/>
+              </w:rPr>
+              <w:t>Pantalla funcional</w:t>
+            </w:r>
           </w:p>
         </w:tc>
         <w:tc>
@@ -15959,19 +13333,11 @@
             <w:pPr>
               <w:spacing w:before="40" w:after="60" w:line="252" w:lineRule="auto"/>
             </w:pPr>
-            <w:proofErr w:type="spellStart"/>
-            <w:r>
-              <w:rPr>
-                <w:sz w:val="18"/>
-              </w:rPr>
-              <w:t>Comunicación</w:t>
-            </w:r>
-            <w:proofErr w:type="spellEnd"/>
-            <w:r>
-              <w:rPr>
-                <w:sz w:val="18"/>
-              </w:rPr>
-              <w:t xml:space="preserve"> real con backend</w:t>
+            <w:r>
+              <w:rPr>
+                <w:sz w:val="18"/>
+              </w:rPr>
+              <w:t>Comunicación real con backend</w:t>
             </w:r>
           </w:p>
         </w:tc>
@@ -16050,30 +13416,8 @@
               <w:rPr>
                 <w:sz w:val="18"/>
               </w:rPr>
-              <w:t xml:space="preserve">Dato </w:t>
-            </w:r>
-            <w:proofErr w:type="spellStart"/>
-            <w:r>
-              <w:rPr>
-                <w:sz w:val="18"/>
-              </w:rPr>
-              <w:t>reciente</w:t>
-            </w:r>
-            <w:proofErr w:type="spellEnd"/>
-            <w:r>
-              <w:rPr>
-                <w:sz w:val="18"/>
-              </w:rPr>
-              <w:t xml:space="preserve"> y </w:t>
-            </w:r>
-            <w:proofErr w:type="spellStart"/>
-            <w:r>
-              <w:rPr>
-                <w:sz w:val="18"/>
-              </w:rPr>
-              <w:t>fecha</w:t>
-            </w:r>
-            <w:proofErr w:type="spellEnd"/>
+              <w:t>Dato reciente y fecha</w:t>
+            </w:r>
           </w:p>
         </w:tc>
         <w:tc>
@@ -16271,37 +13615,12 @@
                 <w:lang w:val="es-MX"/>
               </w:rPr>
             </w:pPr>
-            <w:proofErr w:type="spellStart"/>
-            <w:r>
-              <w:rPr>
-                <w:sz w:val="18"/>
-                <w:lang w:val="es-MX"/>
-              </w:rPr>
-              <w:t>ReadingState</w:t>
-            </w:r>
-            <w:proofErr w:type="spellEnd"/>
-            <w:r>
-              <w:rPr>
-                <w:sz w:val="18"/>
-                <w:lang w:val="es-MX"/>
-              </w:rPr>
-              <w:t xml:space="preserve"> y pruebas Android; sin </w:t>
-            </w:r>
-            <w:proofErr w:type="spellStart"/>
-            <w:r>
-              <w:rPr>
-                <w:sz w:val="18"/>
-                <w:lang w:val="es-MX"/>
-              </w:rPr>
-              <w:t>fallback</w:t>
-            </w:r>
-            <w:proofErr w:type="spellEnd"/>
-            <w:r>
-              <w:rPr>
-                <w:sz w:val="18"/>
-                <w:lang w:val="es-MX"/>
-              </w:rPr>
-              <w:t xml:space="preserve"> de producción.</w:t>
+            <w:r>
+              <w:rPr>
+                <w:sz w:val="18"/>
+                <w:lang w:val="es-MX"/>
+              </w:rPr>
+              <w:t>ReadingState y pruebas Android; sin fallback de producción.</w:t>
             </w:r>
           </w:p>
         </w:tc>
@@ -16338,34 +13657,8 @@
           <w:b/>
           <w:sz w:val="29"/>
         </w:rPr>
-        <w:lastRenderedPageBreak/>
-        <w:t xml:space="preserve">14. </w:t>
+        <w:t>14. Revisión de pruebas</w:t>
       </w:r>
-      <w:proofErr w:type="spellStart"/>
-      <w:r>
-        <w:rPr>
-          <w:b/>
-          <w:sz w:val="29"/>
-        </w:rPr>
-        <w:t>Revisión</w:t>
-      </w:r>
-      <w:proofErr w:type="spellEnd"/>
-      <w:r>
-        <w:rPr>
-          <w:b/>
-          <w:sz w:val="29"/>
-        </w:rPr>
-        <w:t xml:space="preserve"> de </w:t>
-      </w:r>
-      <w:proofErr w:type="spellStart"/>
-      <w:r>
-        <w:rPr>
-          <w:b/>
-          <w:sz w:val="29"/>
-        </w:rPr>
-        <w:t>pruebas</w:t>
-      </w:r>
-      <w:proofErr w:type="spellEnd"/>
       <w:r>
         <w:rPr>
           <w:b/>
@@ -16633,23 +13926,7 @@
                 <w:sz w:val="18"/>
                 <w:lang w:val="es-MX"/>
               </w:rPr>
-              <w:t xml:space="preserve">14 STORED, cero </w:t>
-            </w:r>
-            <w:proofErr w:type="spellStart"/>
-            <w:r>
-              <w:rPr>
-                <w:sz w:val="18"/>
-                <w:lang w:val="es-MX"/>
-              </w:rPr>
-              <w:t>publish</w:t>
-            </w:r>
-            <w:proofErr w:type="spellEnd"/>
-            <w:r>
-              <w:rPr>
-                <w:sz w:val="18"/>
-                <w:lang w:val="es-MX"/>
-              </w:rPr>
-              <w:t xml:space="preserve"> fallidos; rechazo previo documentado.</w:t>
+              <w:t>14 STORED, cero publish fallidos; rechazo previo documentado.</w:t>
             </w:r>
           </w:p>
         </w:tc>
@@ -16682,17 +13959,8 @@
                 <w:sz w:val="18"/>
                 <w:lang w:val="es-MX"/>
               </w:rPr>
-              <w:t xml:space="preserve">Tiempo aproximado sensor a </w:t>
-            </w:r>
-            <w:proofErr w:type="spellStart"/>
-            <w:r>
-              <w:rPr>
-                <w:sz w:val="18"/>
-                <w:lang w:val="es-MX"/>
-              </w:rPr>
-              <w:t>frontend</w:t>
-            </w:r>
-            <w:proofErr w:type="spellEnd"/>
+              <w:t>Tiempo aproximado sensor a frontend</w:t>
+            </w:r>
           </w:p>
         </w:tc>
         <w:tc>
@@ -16819,21 +14087,12 @@
                 <w:lang w:val="es-MX"/>
               </w:rPr>
             </w:pPr>
-            <w:proofErr w:type="spellStart"/>
-            <w:r>
-              <w:rPr>
-                <w:sz w:val="18"/>
-                <w:lang w:val="es-MX"/>
-              </w:rPr>
-              <w:t>ph</w:t>
-            </w:r>
-            <w:proofErr w:type="spellEnd"/>
-            <w:r>
-              <w:rPr>
-                <w:sz w:val="18"/>
-                <w:lang w:val="es-MX"/>
-              </w:rPr>
-              <w:t>=50 rechazado y reconexión física local 901–902.</w:t>
+            <w:r>
+              <w:rPr>
+                <w:sz w:val="18"/>
+                <w:lang w:val="es-MX"/>
+              </w:rPr>
+              <w:t>ph=50 rechazado y reconexión física local 901–902.</w:t>
             </w:r>
           </w:p>
         </w:tc>
@@ -16858,28 +14117,12 @@
             <w:pPr>
               <w:spacing w:before="40" w:after="60" w:line="252" w:lineRule="auto"/>
             </w:pPr>
-            <w:proofErr w:type="spellStart"/>
-            <w:r>
-              <w:rPr>
-                <w:sz w:val="18"/>
-              </w:rPr>
-              <w:t>Problemas</w:t>
-            </w:r>
-            <w:proofErr w:type="spellEnd"/>
-            <w:r>
-              <w:rPr>
-                <w:sz w:val="18"/>
-              </w:rPr>
-              <w:t xml:space="preserve"> y </w:t>
-            </w:r>
-            <w:proofErr w:type="spellStart"/>
-            <w:r>
-              <w:rPr>
-                <w:sz w:val="18"/>
-              </w:rPr>
-              <w:t>correcciones</w:t>
-            </w:r>
-            <w:proofErr w:type="spellEnd"/>
+            <w:r>
+              <w:rPr>
+                <w:sz w:val="18"/>
+              </w:rPr>
+              <w:t>Problemas y correcciones</w:t>
+            </w:r>
           </w:p>
         </w:tc>
         <w:tc>
@@ -16957,30 +14200,8 @@
               <w:rPr>
                 <w:sz w:val="18"/>
               </w:rPr>
-              <w:t xml:space="preserve">Código </w:t>
-            </w:r>
-            <w:proofErr w:type="spellStart"/>
-            <w:r>
-              <w:rPr>
-                <w:sz w:val="18"/>
-              </w:rPr>
-              <w:t>fuente</w:t>
-            </w:r>
-            <w:proofErr w:type="spellEnd"/>
-            <w:r>
-              <w:rPr>
-                <w:sz w:val="18"/>
-              </w:rPr>
-              <w:t xml:space="preserve"> </w:t>
-            </w:r>
-            <w:proofErr w:type="spellStart"/>
-            <w:r>
-              <w:rPr>
-                <w:sz w:val="18"/>
-              </w:rPr>
-              <w:t>inicial</w:t>
-            </w:r>
-            <w:proofErr w:type="spellEnd"/>
+              <w:t>Código fuente inicial</w:t>
+            </w:r>
           </w:p>
         </w:tc>
         <w:tc>
@@ -17137,16 +14358,8 @@
               <w:rPr>
                 <w:sz w:val="18"/>
               </w:rPr>
-              <w:t xml:space="preserve">Video breve de </w:t>
-            </w:r>
-            <w:proofErr w:type="spellStart"/>
-            <w:r>
-              <w:rPr>
-                <w:sz w:val="18"/>
-              </w:rPr>
-              <w:t>funcionamiento</w:t>
-            </w:r>
-            <w:proofErr w:type="spellEnd"/>
+              <w:t>Video breve de funcionamiento</w:t>
+            </w:r>
           </w:p>
         </w:tc>
         <w:tc>
@@ -17220,28 +14433,12 @@
             <w:pPr>
               <w:spacing w:before="40" w:after="60" w:line="252" w:lineRule="auto"/>
             </w:pPr>
-            <w:proofErr w:type="spellStart"/>
-            <w:r>
-              <w:rPr>
-                <w:sz w:val="18"/>
-              </w:rPr>
-              <w:t>Evidencia</w:t>
-            </w:r>
-            <w:proofErr w:type="spellEnd"/>
-            <w:r>
-              <w:rPr>
-                <w:sz w:val="18"/>
-              </w:rPr>
-              <w:t xml:space="preserve"> de backend </w:t>
-            </w:r>
-            <w:proofErr w:type="spellStart"/>
-            <w:r>
-              <w:rPr>
-                <w:sz w:val="18"/>
-              </w:rPr>
-              <w:t>desplegado</w:t>
-            </w:r>
-            <w:proofErr w:type="spellEnd"/>
+            <w:r>
+              <w:rPr>
+                <w:sz w:val="18"/>
+              </w:rPr>
+              <w:t>Evidencia de backend desplegado</w:t>
+            </w:r>
           </w:p>
         </w:tc>
         <w:tc>
@@ -17319,21 +14516,7 @@
               <w:rPr>
                 <w:sz w:val="18"/>
               </w:rPr>
-              <w:t xml:space="preserve">Estructura </w:t>
-            </w:r>
-            <w:proofErr w:type="spellStart"/>
-            <w:r>
-              <w:rPr>
-                <w:sz w:val="18"/>
-              </w:rPr>
-              <w:t>inicial</w:t>
-            </w:r>
-            <w:proofErr w:type="spellEnd"/>
-            <w:r>
-              <w:rPr>
-                <w:sz w:val="18"/>
-              </w:rPr>
-              <w:t xml:space="preserve"> de BD</w:t>
+              <w:t>Estructura inicial de BD</w:t>
             </w:r>
           </w:p>
         </w:tc>
@@ -17412,21 +14595,7 @@
               <w:rPr>
                 <w:sz w:val="18"/>
               </w:rPr>
-              <w:t xml:space="preserve">Frontend con </w:t>
-            </w:r>
-            <w:proofErr w:type="spellStart"/>
-            <w:r>
-              <w:rPr>
-                <w:sz w:val="18"/>
-              </w:rPr>
-              <w:t>datos</w:t>
-            </w:r>
-            <w:proofErr w:type="spellEnd"/>
-            <w:r>
-              <w:rPr>
-                <w:sz w:val="18"/>
-              </w:rPr>
-              <w:t xml:space="preserve"> reales</w:t>
+              <w:t>Frontend con datos reales</w:t>
             </w:r>
           </w:p>
         </w:tc>
@@ -17505,16 +14674,8 @@
               <w:rPr>
                 <w:sz w:val="18"/>
               </w:rPr>
-              <w:t xml:space="preserve">Git y README </w:t>
-            </w:r>
-            <w:proofErr w:type="spellStart"/>
-            <w:r>
-              <w:rPr>
-                <w:sz w:val="18"/>
-              </w:rPr>
-              <w:t>básico</w:t>
-            </w:r>
-            <w:proofErr w:type="spellEnd"/>
+              <w:t>Git y README básico</w:t>
+            </w:r>
           </w:p>
         </w:tc>
         <w:tc>
@@ -17563,39 +14724,7 @@
                 <w:sz w:val="18"/>
                 <w:lang w:val="es-MX"/>
               </w:rPr>
-              <w:t>github.com/</w:t>
-            </w:r>
-            <w:proofErr w:type="spellStart"/>
-            <w:r>
-              <w:rPr>
-                <w:sz w:val="18"/>
-                <w:lang w:val="es-MX"/>
-              </w:rPr>
-              <w:t>komvo</w:t>
-            </w:r>
-            <w:proofErr w:type="spellEnd"/>
-            <w:r>
-              <w:rPr>
-                <w:sz w:val="18"/>
-                <w:lang w:val="es-MX"/>
-              </w:rPr>
-              <w:t>/</w:t>
-            </w:r>
-            <w:proofErr w:type="spellStart"/>
-            <w:r>
-              <w:rPr>
-                <w:sz w:val="18"/>
-                <w:lang w:val="es-MX"/>
-              </w:rPr>
-              <w:t>HydroMate</w:t>
-            </w:r>
-            <w:proofErr w:type="spellEnd"/>
-            <w:r>
-              <w:rPr>
-                <w:sz w:val="18"/>
-                <w:lang w:val="es-MX"/>
-              </w:rPr>
-              <w:t>; README raíz y guías por componente.</w:t>
+              <w:t>github.com/komvo/HydroMate; README raíz y guías por componente.</w:t>
             </w:r>
           </w:p>
         </w:tc>
@@ -17620,19 +14749,11 @@
             <w:pPr>
               <w:spacing w:before="40" w:after="60" w:line="252" w:lineRule="auto"/>
             </w:pPr>
-            <w:proofErr w:type="spellStart"/>
-            <w:r>
-              <w:rPr>
-                <w:sz w:val="18"/>
-              </w:rPr>
-              <w:t>Cronograma</w:t>
-            </w:r>
-            <w:proofErr w:type="spellEnd"/>
-            <w:r>
-              <w:rPr>
-                <w:sz w:val="18"/>
-              </w:rPr>
-              <w:t xml:space="preserve"> restante</w:t>
+            <w:r>
+              <w:rPr>
+                <w:sz w:val="18"/>
+              </w:rPr>
+              <w:t>Cronograma restante</w:t>
             </w:r>
           </w:p>
         </w:tc>
@@ -17707,28 +14828,12 @@
             <w:pPr>
               <w:spacing w:before="40" w:after="60" w:line="252" w:lineRule="auto"/>
             </w:pPr>
-            <w:proofErr w:type="spellStart"/>
-            <w:r>
-              <w:rPr>
-                <w:sz w:val="18"/>
-              </w:rPr>
-              <w:t>Presupuesto</w:t>
-            </w:r>
-            <w:proofErr w:type="spellEnd"/>
-            <w:r>
-              <w:rPr>
-                <w:sz w:val="18"/>
-              </w:rPr>
-              <w:t xml:space="preserve"> </w:t>
-            </w:r>
-            <w:proofErr w:type="spellStart"/>
-            <w:r>
-              <w:rPr>
-                <w:sz w:val="18"/>
-              </w:rPr>
-              <w:t>preliminar</w:t>
-            </w:r>
-            <w:proofErr w:type="spellEnd"/>
+            <w:r>
+              <w:rPr>
+                <w:sz w:val="18"/>
+              </w:rPr>
+              <w:t>Presupuesto preliminar</w:t>
+            </w:r>
           </w:p>
         </w:tc>
         <w:tc>
@@ -17912,19 +15017,11 @@
             <w:pPr>
               <w:spacing w:before="40" w:after="60" w:line="252" w:lineRule="auto"/>
             </w:pPr>
-            <w:proofErr w:type="spellStart"/>
-            <w:r>
-              <w:rPr>
-                <w:sz w:val="18"/>
-              </w:rPr>
-              <w:t>Aut</w:t>
-            </w:r>
-            <w:proofErr w:type="spellEnd"/>
-            <w:r>
-              <w:rPr>
-                <w:sz w:val="18"/>
-              </w:rPr>
-              <w:t>.</w:t>
+            <w:r>
+              <w:rPr>
+                <w:sz w:val="18"/>
+              </w:rPr>
+              <w:t>Aut.</w:t>
             </w:r>
           </w:p>
         </w:tc>
@@ -18052,7 +15149,13 @@
         <w:rPr>
           <w:lang w:val="es-MX"/>
         </w:rPr>
-        <w:t>Aut. indica aplazamiento autorizado según la confirmación del responsable. El presupuesto se actualiza con importes pagados confirmados; la diferencia del desglose electrónico se señala en su sección.</w:t>
+        <w:t>Aut. indica aplazamiento con autorización docente.</w:t>
+      </w:r>
+      <w:r>
+        <w:rPr>
+          <w:lang w:val="es-MX"/>
+        </w:rPr>
+        <w:t xml:space="preserve"> El presupuesto se actualiza con importes pagados confirmados; la diferencia del desglose electrónico se señala en su sección.</w:t>
       </w:r>
     </w:p>
     <w:p>
@@ -18096,7 +15199,6 @@
           <w:sz w:val="29"/>
           <w:lang w:val="es-MX"/>
         </w:rPr>
-        <w:lastRenderedPageBreak/>
         <w:t>1</w:t>
       </w:r>
       <w:r>
@@ -18189,7 +15291,23 @@
           <w:sz w:val="17"/>
           <w:lang w:val="es-MX"/>
         </w:rPr>
-        <w:t>Figura 5. Sondas utilizadas en el banco con agua. Fotografía proporcionada por el responsable para documentar el montaje de la prueba.</w:t>
+        <w:t xml:space="preserve">Figura 5. Sondas utilizadas en el banco con agua. </w:t>
+      </w:r>
+      <w:r>
+        <w:rPr>
+          <w:i/>
+          <w:sz w:val="17"/>
+          <w:lang w:val="es-MX"/>
+        </w:rPr>
+        <w:t>Fotografía tomada para documentar</w:t>
+      </w:r>
+      <w:r>
+        <w:rPr>
+          <w:i/>
+          <w:sz w:val="17"/>
+          <w:lang w:val="es-MX"/>
+        </w:rPr>
+        <w:t xml:space="preserve"> el montaje de la prueba.</w:t>
       </w:r>
     </w:p>
     <w:p>
@@ -18219,19 +15337,8 @@
           <w:sz w:val="29"/>
           <w:lang w:val="es-MX"/>
         </w:rPr>
-        <w:lastRenderedPageBreak/>
-        <w:t xml:space="preserve">16. ESP32 y módulos sobre </w:t>
+        <w:t>16. ESP32 y módulos sobre protoboard</w:t>
       </w:r>
-      <w:proofErr w:type="spellStart"/>
-      <w:r>
-        <w:rPr>
-          <w:b/>
-          <w:sz w:val="29"/>
-          <w:lang w:val="es-MX"/>
-        </w:rPr>
-        <w:t>protoboard</w:t>
-      </w:r>
-      <w:proofErr w:type="spellEnd"/>
     </w:p>
     <w:p>
       <w:pPr>
@@ -18244,16 +15351,8 @@
         <w:rPr>
           <w:lang w:val="es-MX"/>
         </w:rPr>
-        <w:t xml:space="preserve">El ESP32 se conecta por USB y concentra las entradas de los sensores en la </w:t>
+        <w:t>El ESP32 se conecta por USB y concentra las entradas de los sensores en la protoboard</w:t>
       </w:r>
-      <w:proofErr w:type="spellStart"/>
-      <w:r>
-        <w:rPr>
-          <w:lang w:val="es-MX"/>
-        </w:rPr>
-        <w:t>protoboard</w:t>
-      </w:r>
-      <w:proofErr w:type="spellEnd"/>
       <w:r>
         <w:rPr>
           <w:lang w:val="es-MX"/>
@@ -18372,21 +15471,12 @@
       <w:pStyle w:val="Footer"/>
       <w:jc w:val="center"/>
     </w:pPr>
-    <w:proofErr w:type="spellStart"/>
     <w:r>
       <w:rPr>
         <w:color w:val="646464"/>
         <w:sz w:val="16"/>
       </w:rPr>
-      <w:t>HydroMate</w:t>
-    </w:r>
-    <w:proofErr w:type="spellEnd"/>
-    <w:r>
-      <w:rPr>
-        <w:color w:val="646464"/>
-        <w:sz w:val="16"/>
-      </w:rPr>
-      <w:t xml:space="preserve"> — Taller 5 — Proyecto de Carrera</w:t>
+      <w:t>HydroMate — Taller 5 — Proyecto de Carrera</w:t>
     </w:r>
   </w:p>
 </w:ftr>

</xml_diff>